<commit_message>
fix: improve text wrapping and indentation in generated documents
</commit_message>
<xml_diff>
--- a/apps/api/src/modules/applications/templates/arf-contract-facility-lo.docx
+++ b/apps/api/src/modules/applications/templates/arf-contract-facility-lo.docx
@@ -247,39 +247,44 @@
     </w:p>
     <w:p>
       <w:pPr>
+        <w:tabs>
+          <w:tab w:val="left" w:pos="2160"/>
+        </w:tabs>
+        <w:ind w:left="2160" w:hanging="2160"/>
+        <w:jc w:val="left"/>
+        <w:rPr>
+          <w:sz w:val="20"/>
+          <w:szCs w:val="20"/>
+        </w:rPr>
+      </w:pPr>
+      <w:r>
+        <w:rPr>
+          <w:sz w:val="20"/>
+          <w:szCs w:val="20"/>
+        </w:rPr>
+        <w:t>Attention :</w:t>
+      </w:r>
+      <w:r>
+        <w:rPr>
+          <w:sz w:val="20"/>
+          <w:szCs w:val="20"/>
+        </w:rPr>
+        <w:tab/>
+      </w:r>
+      <w:r>
+        <w:rPr>
+          <w:sz w:val="20"/>
+          <w:szCs w:val="20"/>
+          <w:highlight w:val="yellow"/>
+        </w:rPr>
+        <w:t>{attention_name}</w:t>
+      </w:r>
+    </w:p>
+    <w:p>
+      <w:pPr>
+        <w:ind w:left="1440"/>
+        <w:jc w:val="left"/>
         <w:spacing w:after="0" w:line="360" w:lineRule="auto"/>
-        <w:rPr>
-          <w:sz w:val="20"/>
-          <w:szCs w:val="20"/>
-        </w:rPr>
-      </w:pPr>
-      <w:r>
-        <w:rPr>
-          <w:sz w:val="20"/>
-          <w:szCs w:val="20"/>
-        </w:rPr>
-        <w:t>Attention :</w:t>
-      </w:r>
-      <w:r>
-        <w:rPr>
-          <w:sz w:val="20"/>
-          <w:szCs w:val="20"/>
-        </w:rPr>
-        <w:tab/>
-      </w:r>
-      <w:r>
-        <w:rPr>
-          <w:sz w:val="20"/>
-          <w:szCs w:val="20"/>
-          <w:highlight w:val="yellow"/>
-        </w:rPr>
-        <w:t>{attention_name}</w:t>
-      </w:r>
-    </w:p>
-    <w:p>
-      <w:pPr>
-        <w:spacing w:after="0" w:line="360" w:lineRule="auto"/>
-        <w:ind w:left="720" w:firstLine="720"/>
         <w:rPr>
           <w:sz w:val="20"/>
           <w:szCs w:val="20"/>

</xml_diff>

<commit_message>
feat: remove invoice sublimits
</commit_message>
<xml_diff>
--- a/apps/api/src/modules/applications/templates/arf-contract-facility-lo.docx
+++ b/apps/api/src/modules/applications/templates/arf-contract-facility-lo.docx
@@ -5706,61 +5706,84 @@
         </w:tc>
       </w:tr>
       <w:tr>
-        <w:trPr>
-          <w:trHeight w:val="907"/>
-        </w:trPr>
         <w:tc>
           <w:tcPr>
             <w:tcW w:w="2263" w:type="dxa"/>
-            <w:vAlign w:val="center"/>
           </w:tcPr>
           <w:p>
             <w:pPr>
               <w:spacing w:line="360" w:lineRule="auto"/>
-            </w:pPr>
-            <w:r>
               <w:rPr>
                 <w:b/>
                 <w:bCs/>
                 <w:sz w:val="20"/>
                 <w:szCs w:val="20"/>
               </w:rPr>
-              <w:t>Sub-Limit per Invoice</w:t>
+            </w:pPr>
+          </w:p>
+          <w:p>
+            <w:pPr>
+              <w:spacing w:line="360" w:lineRule="auto"/>
+            </w:pPr>
+            <w:r>
+              <w:rPr>
+                <w:b/>
+                <w:bCs/>
+                <w:sz w:val="20"/>
+                <w:szCs w:val="20"/>
+              </w:rPr>
+              <w:t>Maximum Financing Margin</w:t>
             </w:r>
           </w:p>
         </w:tc>
         <w:tc>
           <w:tcPr>
             <w:tcW w:w="7087" w:type="dxa"/>
-            <w:vAlign w:val="center"/>
           </w:tcPr>
           <w:p>
             <w:pPr>
               <w:spacing w:line="360" w:lineRule="auto"/>
               <w:jc w:val="both"/>
-            </w:pPr>
-            <w:r>
-              <w:rPr>
-                <w:sz w:val="20"/>
-                <w:szCs w:val="20"/>
-              </w:rPr>
-              <w:t xml:space="preserve">Up to </w:t>
-            </w:r>
-            <w:r>
-              <w:rPr>
-                <w:sz w:val="20"/>
-                <w:szCs w:val="20"/>
-                <w:highlight w:val="yellow"/>
-              </w:rPr>
-              <w:t>{sub_limit_per_invoice_rm}</w:t>
-            </w:r>
-            <w:r>
-              <w:rPr>
-                <w:sz w:val="20"/>
-                <w:szCs w:val="20"/>
-              </w:rPr>
-              <w:t xml:space="preserve"> per invoice, and not exceeding the Maximum Financing Margin of each invoice.</w:t>
-            </w:r>
+              <w:rPr>
+                <w:sz w:val="20"/>
+                <w:szCs w:val="20"/>
+              </w:rPr>
+            </w:pPr>
+          </w:p>
+          <w:p>
+            <w:pPr>
+              <w:spacing w:line="360" w:lineRule="auto"/>
+              <w:jc w:val="both"/>
+              <w:rPr>
+                <w:sz w:val="20"/>
+                <w:szCs w:val="20"/>
+              </w:rPr>
+            </w:pPr>
+            <w:r>
+              <w:rPr>
+                <w:sz w:val="20"/>
+                <w:szCs w:val="20"/>
+              </w:rPr>
+              <w:t>Up to eighty per cent (80%) of the Eligible Invoice Value. The actual financing margin applicable to each Utilization shall be determined by the Operator following its assessment of the Issuer, the Approved Paymaster / Customer, the Receivable, the requested tenure and other relevant factors, and shall be disclosed in the applicable Utilization Offer before acceptance by the Issuer.</w:t>
+            </w:r>
+          </w:p>
+          <w:p>
+            <w:pPr>
+              <w:spacing w:line="360" w:lineRule="auto"/>
+              <w:jc w:val="both"/>
+            </w:pPr>
+          </w:p>
+          <w:p>
+            <w:pPr>
+              <w:spacing w:line="360" w:lineRule="auto"/>
+              <w:jc w:val="both"/>
+            </w:pPr>
+          </w:p>
+          <w:p>
+            <w:pPr>
+              <w:spacing w:line="360" w:lineRule="auto"/>
+              <w:jc w:val="both"/>
+            </w:pPr>
           </w:p>
         </w:tc>
       </w:tr>
@@ -5791,7 +5814,7 @@
                 <w:sz w:val="20"/>
                 <w:szCs w:val="20"/>
               </w:rPr>
-              <w:t>Maximum Financing Margin</w:t>
+              <w:t>Profit Rate</w:t>
             </w:r>
           </w:p>
         </w:tc>
@@ -5823,20 +5846,24 @@
                 <w:sz w:val="20"/>
                 <w:szCs w:val="20"/>
               </w:rPr>
-              <w:t>Up to eighty per cent (80%) of the Eligible Invoice Value. The actual financing margin applicable to each Utilization shall be determined by the Operator following its assessment of the Issuer, the Approved Paymaster / Customer, the Receivable, the requested tenure and other relevant factors, and shall be disclosed in the applicable Utilization Offer before acceptance by the Issuer.</w:t>
-            </w:r>
-          </w:p>
-          <w:p>
-            <w:pPr>
-              <w:spacing w:line="360" w:lineRule="auto"/>
-              <w:jc w:val="both"/>
-            </w:pPr>
-          </w:p>
-          <w:p>
-            <w:pPr>
-              <w:spacing w:line="360" w:lineRule="auto"/>
-              <w:jc w:val="both"/>
-            </w:pPr>
+              <w:t xml:space="preserve">To be determined by the Operator upon utilisation of the financing, not exceeding eighteen per cent (18%) per annum, and subject </w:t>
+            </w:r>
+            <w:proofErr w:type="gramStart"/>
+            <w:r>
+              <w:rPr>
+                <w:sz w:val="20"/>
+                <w:szCs w:val="20"/>
+              </w:rPr>
+              <w:t>at all times</w:t>
+            </w:r>
+            <w:proofErr w:type="gramEnd"/>
+            <w:r>
+              <w:rPr>
+                <w:sz w:val="20"/>
+                <w:szCs w:val="20"/>
+              </w:rPr>
+              <w:t xml:space="preserve"> to the Balance Margin of Financing.</w:t>
+            </w:r>
           </w:p>
           <w:p>
             <w:pPr>
@@ -5873,7 +5900,7 @@
                 <w:sz w:val="20"/>
                 <w:szCs w:val="20"/>
               </w:rPr>
-              <w:t>Profit Rate</w:t>
+              <w:t>Tenure</w:t>
             </w:r>
           </w:p>
         </w:tc>
@@ -5905,23 +5932,22 @@
                 <w:sz w:val="20"/>
                 <w:szCs w:val="20"/>
               </w:rPr>
-              <w:t xml:space="preserve">To be determined by the Operator upon utilisation of the financing, not exceeding eighteen per cent (18%) per annum, and subject </w:t>
-            </w:r>
-            <w:proofErr w:type="gramStart"/>
-            <w:r>
-              <w:rPr>
-                <w:sz w:val="20"/>
-                <w:szCs w:val="20"/>
-              </w:rPr>
-              <w:t>at all times</w:t>
-            </w:r>
-            <w:proofErr w:type="gramEnd"/>
-            <w:r>
-              <w:rPr>
-                <w:sz w:val="20"/>
-                <w:szCs w:val="20"/>
-              </w:rPr>
-              <w:t xml:space="preserve"> to the Balance Margin of Financing.</w:t>
+              <w:t xml:space="preserve">Minimum 30 days up to a maximum of </w:t>
+            </w:r>
+            <w:r>
+              <w:rPr>
+                <w:sz w:val="20"/>
+                <w:szCs w:val="20"/>
+                <w:highlight w:val="yellow"/>
+              </w:rPr>
+              <w:t>{max_invoice_tenure_days}</w:t>
+            </w:r>
+            <w:r>
+              <w:rPr>
+                <w:sz w:val="20"/>
+                <w:szCs w:val="20"/>
+              </w:rPr>
+              <w:t xml:space="preserve"> days, in increments of 15 days.</w:t>
             </w:r>
           </w:p>
           <w:p>
@@ -5959,7 +5985,7 @@
                 <w:sz w:val="20"/>
                 <w:szCs w:val="20"/>
               </w:rPr>
-              <w:t>Tenure</w:t>
+              <w:t>Drawdowns</w:t>
             </w:r>
           </w:p>
         </w:tc>
@@ -5991,92 +6017,7 @@
                 <w:sz w:val="20"/>
                 <w:szCs w:val="20"/>
               </w:rPr>
-              <w:t xml:space="preserve">Minimum 30 days up to a maximum of </w:t>
-            </w:r>
-            <w:r>
-              <w:rPr>
-                <w:sz w:val="20"/>
-                <w:szCs w:val="20"/>
-                <w:highlight w:val="yellow"/>
-              </w:rPr>
-              <w:t>{max_invoice_tenure_days}</w:t>
-            </w:r>
-            <w:r>
-              <w:rPr>
-                <w:sz w:val="20"/>
-                <w:szCs w:val="20"/>
-              </w:rPr>
-              <w:t xml:space="preserve"> days, in increments of 15 days.</w:t>
-            </w:r>
-          </w:p>
-          <w:p>
-            <w:pPr>
-              <w:spacing w:line="360" w:lineRule="auto"/>
-              <w:jc w:val="both"/>
-            </w:pPr>
-          </w:p>
-        </w:tc>
-      </w:tr>
-      <w:tr>
-        <w:tc>
-          <w:tcPr>
-            <w:tcW w:w="2263" w:type="dxa"/>
-          </w:tcPr>
-          <w:p>
-            <w:pPr>
-              <w:spacing w:line="360" w:lineRule="auto"/>
-              <w:rPr>
-                <w:b/>
-                <w:bCs/>
-                <w:sz w:val="20"/>
-                <w:szCs w:val="20"/>
-              </w:rPr>
-            </w:pPr>
-          </w:p>
-          <w:p>
-            <w:pPr>
-              <w:spacing w:line="360" w:lineRule="auto"/>
-            </w:pPr>
-            <w:r>
-              <w:rPr>
-                <w:b/>
-                <w:bCs/>
-                <w:sz w:val="20"/>
-                <w:szCs w:val="20"/>
-              </w:rPr>
-              <w:t>Drawdowns</w:t>
-            </w:r>
-          </w:p>
-        </w:tc>
-        <w:tc>
-          <w:tcPr>
-            <w:tcW w:w="7087" w:type="dxa"/>
-          </w:tcPr>
-          <w:p>
-            <w:pPr>
-              <w:spacing w:line="360" w:lineRule="auto"/>
-              <w:jc w:val="both"/>
-              <w:rPr>
-                <w:sz w:val="20"/>
-                <w:szCs w:val="20"/>
-              </w:rPr>
-            </w:pPr>
-          </w:p>
-          <w:p>
-            <w:pPr>
-              <w:spacing w:line="360" w:lineRule="auto"/>
-              <w:jc w:val="both"/>
-              <w:rPr>
-                <w:sz w:val="20"/>
-                <w:szCs w:val="20"/>
-              </w:rPr>
-            </w:pPr>
-            <w:r>
-              <w:rPr>
-                <w:sz w:val="20"/>
-                <w:szCs w:val="20"/>
-              </w:rPr>
-              <w:t>Multiple drawdowns are permitted against invoices issued under the Assigned Contract(s), subject to the approved Financing Limit and applicable Sub-Limit.</w:t>
+              <w:t>Multiple drawdowns are permitted against invoices issued under the Assigned Contract(s), subject to the approved Financing Limit.</w:t>
             </w:r>
           </w:p>
           <w:p>

</xml_diff>

<commit_message>
feat: remove yellow highlight in generated documents
</commit_message>
<xml_diff>
--- a/apps/api/src/modules/applications/templates/arf-contract-facility-lo.docx
+++ b/apps/api/src/modules/applications/templates/arf-contract-facility-lo.docx
@@ -36,7 +36,6 @@
         <w:rPr>
           <w:sz w:val="20"/>
           <w:szCs w:val="20"/>
-          <w:highlight w:val="yellow"/>
         </w:rPr>
         <w:t>{issuer_id}</w:t>
       </w:r>
@@ -75,7 +74,6 @@
         <w:rPr>
           <w:sz w:val="20"/>
           <w:szCs w:val="20"/>
-          <w:highlight w:val="yellow"/>
         </w:rPr>
         <w:t>{our_reference}</w:t>
       </w:r>
@@ -121,7 +119,6 @@
         <w:rPr>
           <w:sz w:val="20"/>
           <w:szCs w:val="20"/>
-          <w:highlight w:val="yellow"/>
         </w:rPr>
         <w:t>{letter_date}</w:t>
       </w:r>
@@ -193,7 +190,6 @@
           <w:bCs/>
           <w:sz w:val="20"/>
           <w:szCs w:val="20"/>
-          <w:highlight w:val="yellow"/>
         </w:rPr>
         <w:t>{issuer_name}</w:t>
       </w:r>
@@ -214,7 +210,6 @@
           <w:bCs/>
           <w:sz w:val="20"/>
           <w:szCs w:val="20"/>
-          <w:highlight w:val="yellow"/>
         </w:rPr>
         <w:t>{issuer_registration_number}</w:t>
       </w:r>
@@ -231,7 +226,6 @@
         <w:rPr>
           <w:sz w:val="20"/>
           <w:szCs w:val="20"/>
-          <w:highlight w:val="yellow"/>
         </w:rPr>
         <w:t>{issuer_address}</w:t>
       </w:r>
@@ -275,7 +269,6 @@
         <w:rPr>
           <w:sz w:val="20"/>
           <w:szCs w:val="20"/>
-          <w:highlight w:val="yellow"/>
         </w:rPr>
         <w:t>{attention_name}</w:t>
       </w:r>
@@ -294,7 +287,6 @@
         <w:rPr>
           <w:sz w:val="20"/>
           <w:szCs w:val="20"/>
-          <w:highlight w:val="yellow"/>
         </w:rPr>
         <w:t>{attention_position}</w:t>
       </w:r>
@@ -566,7 +558,6 @@
               <w:rPr>
                 <w:sz w:val="20"/>
                 <w:szCs w:val="20"/>
-                <w:highlight w:val="yellow"/>
               </w:rPr>
               <w:t>{issuer_name}</w:t>
             </w:r>
@@ -914,7 +905,6 @@
               <w:rPr>
                 <w:sz w:val="20"/>
                 <w:szCs w:val="20"/>
-                <w:highlight w:val="yellow"/>
               </w:rPr>
               <w:t>{financing_limit_rm}</w:t>
             </w:r>
@@ -1594,7 +1584,6 @@
               <w:rPr>
                 <w:sz w:val="20"/>
                 <w:szCs w:val="20"/>
-                <w:highlight w:val="yellow"/>
               </w:rPr>
               <w:t>{tenure_days}</w:t>
             </w:r>
@@ -2025,7 +2014,6 @@
               <w:rPr>
                 <w:sz w:val="20"/>
                 <w:szCs w:val="20"/>
-                <w:highlight w:val="yellow"/>
               </w:rPr>
               <w:t>{line}</w:t>
             </w:r>
@@ -2065,7 +2053,6 @@
               <w:rPr>
                 <w:sz w:val="20"/>
                 <w:szCs w:val="20"/>
-                <w:highlight w:val="yellow"/>
               </w:rPr>
               <w:t>{rep_line}</w:t>
             </w:r>
@@ -3301,7 +3288,6 @@
               <w:rPr>
                 <w:sz w:val="20"/>
                 <w:szCs w:val="20"/>
-                <w:highlight w:val="yellow"/>
               </w:rPr>
               <w:t>{payment_period_days}</w:t>
             </w:r>
@@ -3417,7 +3403,6 @@
               <w:rPr>
                 <w:sz w:val="20"/>
                 <w:szCs w:val="20"/>
-                <w:highlight w:val="yellow"/>
               </w:rPr>
               <w:t>{grace_period_days}</w:t>
             </w:r>
@@ -3432,7 +3417,6 @@
               <w:rPr>
                 <w:sz w:val="20"/>
                 <w:szCs w:val="20"/>
-                <w:highlight w:val="yellow"/>
               </w:rPr>
               <w:t>{grace_period_days_words}</w:t>
             </w:r>
@@ -4826,7 +4810,6 @@
               <w:rPr>
                 <w:sz w:val="20"/>
                 <w:szCs w:val="20"/>
-                <w:highlight w:val="yellow"/>
               </w:rPr>
               <w:t>{transaction_docs_days}</w:t>
             </w:r>
@@ -4841,7 +4824,6 @@
               <w:rPr>
                 <w:sz w:val="20"/>
                 <w:szCs w:val="20"/>
-                <w:highlight w:val="yellow"/>
               </w:rPr>
               <w:t>{transaction_docs_days_words}</w:t>
             </w:r>
@@ -5092,7 +5074,6 @@
         <w:rPr>
           <w:sz w:val="20"/>
           <w:szCs w:val="20"/>
-          <w:highlight w:val="yellow"/>
         </w:rPr>
         <w:t>{offer_validity_phrase}</w:t>
       </w:r>
@@ -5302,7 +5283,6 @@
         <w:rPr>
           <w:sz w:val="20"/>
           <w:szCs w:val="20"/>
-          <w:highlight w:val="yellow"/>
         </w:rPr>
         <w:t>{offer_validity_phrase}</w:t>
       </w:r>
@@ -5480,7 +5460,6 @@
           <w:rFonts w:ascii="Segoe UI Symbol" w:hAnsi="Segoe UI Symbol" w:cs="Segoe UI Symbol"/>
           <w:sz w:val="20"/>
           <w:szCs w:val="20"/>
-          <w:highlight w:val="yellow"/>
         </w:rPr>
         <w:t>{part_a_</w:t>
       </w:r>
@@ -5490,7 +5469,6 @@
           <w:rFonts w:ascii="Segoe UI Symbol" w:hAnsi="Segoe UI Symbol" w:cs="Segoe UI Symbol"/>
           <w:sz w:val="20"/>
           <w:szCs w:val="20"/>
-          <w:highlight w:val="yellow"/>
         </w:rPr>
         <w:t>checkbox}</w:t>
       </w:r>
@@ -5520,7 +5498,6 @@
           <w:rFonts w:ascii="Segoe UI Symbol" w:hAnsi="Segoe UI Symbol" w:cs="Segoe UI Symbol"/>
           <w:sz w:val="20"/>
           <w:szCs w:val="20"/>
-          <w:highlight w:val="yellow"/>
         </w:rPr>
         <w:t>{part_b_</w:t>
       </w:r>
@@ -5530,7 +5507,6 @@
           <w:rFonts w:ascii="Segoe UI Symbol" w:hAnsi="Segoe UI Symbol" w:cs="Segoe UI Symbol"/>
           <w:sz w:val="20"/>
           <w:szCs w:val="20"/>
-          <w:highlight w:val="yellow"/>
         </w:rPr>
         <w:t>checkbox}</w:t>
       </w:r>
@@ -5665,7 +5641,6 @@
               <w:rPr>
                 <w:sz w:val="20"/>
                 <w:szCs w:val="20"/>
-                <w:highlight w:val="yellow"/>
               </w:rPr>
               <w:t>{financing_limit_rm}</w:t>
             </w:r>
@@ -5938,7 +5913,6 @@
               <w:rPr>
                 <w:sz w:val="20"/>
                 <w:szCs w:val="20"/>
-                <w:highlight w:val="yellow"/>
               </w:rPr>
               <w:t>{max_invoice_tenure_days}</w:t>
             </w:r>
@@ -6622,7 +6596,6 @@
               <w:rPr>
                 <w:sz w:val="20"/>
                 <w:szCs w:val="20"/>
-                <w:highlight w:val="yellow"/>
               </w:rPr>
               <w:t>{part_b_financing_amount_rm}</w:t>
             </w:r>
@@ -6836,7 +6809,6 @@
               <w:rPr>
                 <w:sz w:val="20"/>
                 <w:szCs w:val="20"/>
-                <w:highlight w:val="yellow"/>
               </w:rPr>
               <w:t>{max_invoice_tenure_days}</w:t>
             </w:r>
@@ -7844,7 +7816,6 @@
         <w:rPr>
           <w:sz w:val="20"/>
           <w:szCs w:val="20"/>
-          <w:highlight w:val="yellow"/>
         </w:rPr>
         <w:t>{assigned_contract_date}</w:t>
       </w:r>
@@ -7859,7 +7830,6 @@
         <w:rPr>
           <w:sz w:val="20"/>
           <w:szCs w:val="20"/>
-          <w:highlight w:val="yellow"/>
         </w:rPr>
         <w:t>{assigned_contract_counterparty}</w:t>
       </w:r>
@@ -7874,7 +7844,6 @@
         <w:rPr>
           <w:sz w:val="20"/>
           <w:szCs w:val="20"/>
-          <w:highlight w:val="yellow"/>
         </w:rPr>
         <w:t>{assigned_contract_description}</w:t>
       </w:r>
@@ -8004,7 +7973,6 @@
           <w:bCs/>
           <w:sz w:val="20"/>
           <w:szCs w:val="20"/>
-          <w:highlight w:val="yellow"/>
           <w:u w:val="single"/>
         </w:rPr>
         <w:t>{letter_date}</w:t>
@@ -8046,7 +8014,6 @@
         <w:rPr>
           <w:sz w:val="20"/>
           <w:szCs w:val="20"/>
-          <w:highlight w:val="yellow"/>
         </w:rPr>
         <w:t>{issuer_name}</w:t>
       </w:r>
@@ -8061,7 +8028,6 @@
         <w:rPr>
           <w:sz w:val="20"/>
           <w:szCs w:val="20"/>
-          <w:highlight w:val="yellow"/>
         </w:rPr>
         <w:t>{issuer_registration_number}</w:t>
       </w:r>
@@ -8076,7 +8042,6 @@
         <w:rPr>
           <w:sz w:val="20"/>
           <w:szCs w:val="20"/>
-          <w:highlight w:val="yellow"/>
         </w:rPr>
         <w:t>{issuer_address}</w:t>
       </w:r>
@@ -8091,7 +8056,6 @@
         <w:rPr>
           <w:sz w:val="20"/>
           <w:szCs w:val="20"/>
-          <w:highlight w:val="yellow"/>
         </w:rPr>
         <w:t>{financing_limit_rm}</w:t>
       </w:r>
@@ -8240,7 +8204,6 @@
         <w:rPr>
           <w:sz w:val="20"/>
           <w:szCs w:val="20"/>
-          <w:highlight w:val="yellow"/>
         </w:rPr>
         <w:t>{issuer_name}</w:t>
       </w:r>
@@ -8255,7 +8218,6 @@
         <w:rPr>
           <w:sz w:val="20"/>
           <w:szCs w:val="20"/>
-          <w:highlight w:val="yellow"/>
         </w:rPr>
         <w:t>{issuer_registration_number}</w:t>
       </w:r>
@@ -8392,7 +8354,6 @@
         <w:rPr>
           <w:sz w:val="20"/>
           <w:szCs w:val="20"/>
-          <w:highlight w:val="yellow"/>
         </w:rPr>
         <w:t>{name}</w:t>
       </w:r>
@@ -8417,7 +8378,6 @@
         <w:rPr>
           <w:sz w:val="20"/>
           <w:szCs w:val="20"/>
-          <w:highlight w:val="yellow"/>
         </w:rPr>
         <w:t>{issuer_name}</w:t>
       </w:r>
@@ -8432,7 +8392,6 @@
         <w:rPr>
           <w:sz w:val="20"/>
           <w:szCs w:val="20"/>
-          <w:highlight w:val="yellow"/>
         </w:rPr>
         <w:t>{letter_date}</w:t>
       </w:r>
@@ -8535,7 +8494,6 @@
         <w:rPr>
           <w:sz w:val="20"/>
           <w:szCs w:val="20"/>
-          <w:highlight w:val="yellow"/>
         </w:rPr>
         <w:t>{name}</w:t>
       </w:r>
@@ -8560,7 +8518,6 @@
         <w:rPr>
           <w:sz w:val="20"/>
           <w:szCs w:val="20"/>
-          <w:highlight w:val="yellow"/>
         </w:rPr>
         <w:t>{nric}</w:t>
       </w:r>
@@ -8728,7 +8685,6 @@
         <w:rPr>
           <w:sz w:val="20"/>
           <w:szCs w:val="20"/>
-          <w:highlight w:val="yellow"/>
         </w:rPr>
         <w:t>{company_name}</w:t>
       </w:r>
@@ -8743,7 +8699,6 @@
         <w:rPr>
           <w:sz w:val="20"/>
           <w:szCs w:val="20"/>
-          <w:highlight w:val="yellow"/>
         </w:rPr>
         <w:t>{company_ssm}</w:t>
       </w:r>
@@ -8758,7 +8713,6 @@
         <w:rPr>
           <w:sz w:val="20"/>
           <w:szCs w:val="20"/>
-          <w:highlight w:val="yellow"/>
         </w:rPr>
         <w:t>{issuer_name}</w:t>
       </w:r>
@@ -8773,7 +8727,6 @@
         <w:rPr>
           <w:sz w:val="20"/>
           <w:szCs w:val="20"/>
-          <w:highlight w:val="yellow"/>
         </w:rPr>
         <w:t>{letter_date}</w:t>
       </w:r>
@@ -8873,7 +8826,6 @@
         <w:rPr>
           <w:sz w:val="20"/>
           <w:szCs w:val="20"/>
-          <w:highlight w:val="yellow"/>
         </w:rPr>
         <w:t>{company_name}</w:t>
       </w:r>
@@ -8891,7 +8843,6 @@
         <w:rPr>
           <w:sz w:val="20"/>
           <w:szCs w:val="20"/>
-          <w:highlight w:val="yellow"/>
         </w:rPr>
         <w:t>{company_ssm}</w:t>
       </w:r>
@@ -8980,7 +8931,6 @@
               <w:rPr>
                 <w:sz w:val="20"/>
                 <w:szCs w:val="20"/>
-                <w:highlight w:val="yellow"/>
               </w:rPr>
               <w:t>{left_name}</w:t>
             </w:r>
@@ -9005,7 +8955,6 @@
               <w:rPr>
                 <w:sz w:val="20"/>
                 <w:szCs w:val="20"/>
-                <w:highlight w:val="yellow"/>
               </w:rPr>
               <w:t>{left_nric}</w:t>
             </w:r>
@@ -9098,7 +9047,6 @@
               <w:rPr>
                 <w:sz w:val="20"/>
                 <w:szCs w:val="20"/>
-                <w:highlight w:val="yellow"/>
               </w:rPr>
               <w:t>{right_name}</w:t>
             </w:r>
@@ -9123,7 +9071,6 @@
               <w:rPr>
                 <w:sz w:val="20"/>
                 <w:szCs w:val="20"/>
-                <w:highlight w:val="yellow"/>
               </w:rPr>
               <w:t>{right_nric}</w:t>
             </w:r>

</xml_diff>

<commit_message>
Fix/document representative missing (#356)
* fix: documents now use the facility offer facility-linked notes

* feat: remove yellow highlight in generated documents
</commit_message>
<xml_diff>
--- a/apps/api/src/modules/applications/templates/arf-contract-facility-lo.docx
+++ b/apps/api/src/modules/applications/templates/arf-contract-facility-lo.docx
@@ -36,7 +36,6 @@
         <w:rPr>
           <w:sz w:val="20"/>
           <w:szCs w:val="20"/>
-          <w:highlight w:val="yellow"/>
         </w:rPr>
         <w:t>{issuer_id}</w:t>
       </w:r>
@@ -75,7 +74,6 @@
         <w:rPr>
           <w:sz w:val="20"/>
           <w:szCs w:val="20"/>
-          <w:highlight w:val="yellow"/>
         </w:rPr>
         <w:t>{our_reference}</w:t>
       </w:r>
@@ -121,7 +119,6 @@
         <w:rPr>
           <w:sz w:val="20"/>
           <w:szCs w:val="20"/>
-          <w:highlight w:val="yellow"/>
         </w:rPr>
         <w:t>{letter_date}</w:t>
       </w:r>
@@ -193,7 +190,6 @@
           <w:bCs/>
           <w:sz w:val="20"/>
           <w:szCs w:val="20"/>
-          <w:highlight w:val="yellow"/>
         </w:rPr>
         <w:t>{issuer_name}</w:t>
       </w:r>
@@ -214,7 +210,6 @@
           <w:bCs/>
           <w:sz w:val="20"/>
           <w:szCs w:val="20"/>
-          <w:highlight w:val="yellow"/>
         </w:rPr>
         <w:t>{issuer_registration_number}</w:t>
       </w:r>
@@ -231,7 +226,6 @@
         <w:rPr>
           <w:sz w:val="20"/>
           <w:szCs w:val="20"/>
-          <w:highlight w:val="yellow"/>
         </w:rPr>
         <w:t>{issuer_address}</w:t>
       </w:r>
@@ -275,7 +269,6 @@
         <w:rPr>
           <w:sz w:val="20"/>
           <w:szCs w:val="20"/>
-          <w:highlight w:val="yellow"/>
         </w:rPr>
         <w:t>{attention_name}</w:t>
       </w:r>
@@ -294,7 +287,6 @@
         <w:rPr>
           <w:sz w:val="20"/>
           <w:szCs w:val="20"/>
-          <w:highlight w:val="yellow"/>
         </w:rPr>
         <w:t>{attention_position}</w:t>
       </w:r>
@@ -566,7 +558,6 @@
               <w:rPr>
                 <w:sz w:val="20"/>
                 <w:szCs w:val="20"/>
-                <w:highlight w:val="yellow"/>
               </w:rPr>
               <w:t>{issuer_name}</w:t>
             </w:r>
@@ -914,7 +905,6 @@
               <w:rPr>
                 <w:sz w:val="20"/>
                 <w:szCs w:val="20"/>
-                <w:highlight w:val="yellow"/>
               </w:rPr>
               <w:t>{financing_limit_rm}</w:t>
             </w:r>
@@ -1594,7 +1584,6 @@
               <w:rPr>
                 <w:sz w:val="20"/>
                 <w:szCs w:val="20"/>
-                <w:highlight w:val="yellow"/>
               </w:rPr>
               <w:t>{tenure_days}</w:t>
             </w:r>
@@ -2025,7 +2014,6 @@
               <w:rPr>
                 <w:sz w:val="20"/>
                 <w:szCs w:val="20"/>
-                <w:highlight w:val="yellow"/>
               </w:rPr>
               <w:t>{line}</w:t>
             </w:r>
@@ -2065,7 +2053,6 @@
               <w:rPr>
                 <w:sz w:val="20"/>
                 <w:szCs w:val="20"/>
-                <w:highlight w:val="yellow"/>
               </w:rPr>
               <w:t>{rep_line}</w:t>
             </w:r>
@@ -3301,7 +3288,6 @@
               <w:rPr>
                 <w:sz w:val="20"/>
                 <w:szCs w:val="20"/>
-                <w:highlight w:val="yellow"/>
               </w:rPr>
               <w:t>{payment_period_days}</w:t>
             </w:r>
@@ -3417,7 +3403,6 @@
               <w:rPr>
                 <w:sz w:val="20"/>
                 <w:szCs w:val="20"/>
-                <w:highlight w:val="yellow"/>
               </w:rPr>
               <w:t>{grace_period_days}</w:t>
             </w:r>
@@ -3432,7 +3417,6 @@
               <w:rPr>
                 <w:sz w:val="20"/>
                 <w:szCs w:val="20"/>
-                <w:highlight w:val="yellow"/>
               </w:rPr>
               <w:t>{grace_period_days_words}</w:t>
             </w:r>
@@ -4826,7 +4810,6 @@
               <w:rPr>
                 <w:sz w:val="20"/>
                 <w:szCs w:val="20"/>
-                <w:highlight w:val="yellow"/>
               </w:rPr>
               <w:t>{transaction_docs_days}</w:t>
             </w:r>
@@ -4841,7 +4824,6 @@
               <w:rPr>
                 <w:sz w:val="20"/>
                 <w:szCs w:val="20"/>
-                <w:highlight w:val="yellow"/>
               </w:rPr>
               <w:t>{transaction_docs_days_words}</w:t>
             </w:r>
@@ -5092,7 +5074,6 @@
         <w:rPr>
           <w:sz w:val="20"/>
           <w:szCs w:val="20"/>
-          <w:highlight w:val="yellow"/>
         </w:rPr>
         <w:t>{offer_validity_phrase}</w:t>
       </w:r>
@@ -5302,7 +5283,6 @@
         <w:rPr>
           <w:sz w:val="20"/>
           <w:szCs w:val="20"/>
-          <w:highlight w:val="yellow"/>
         </w:rPr>
         <w:t>{offer_validity_phrase}</w:t>
       </w:r>
@@ -5480,7 +5460,6 @@
           <w:rFonts w:ascii="Segoe UI Symbol" w:hAnsi="Segoe UI Symbol" w:cs="Segoe UI Symbol"/>
           <w:sz w:val="20"/>
           <w:szCs w:val="20"/>
-          <w:highlight w:val="yellow"/>
         </w:rPr>
         <w:t>{part_a_</w:t>
       </w:r>
@@ -5490,7 +5469,6 @@
           <w:rFonts w:ascii="Segoe UI Symbol" w:hAnsi="Segoe UI Symbol" w:cs="Segoe UI Symbol"/>
           <w:sz w:val="20"/>
           <w:szCs w:val="20"/>
-          <w:highlight w:val="yellow"/>
         </w:rPr>
         <w:t>checkbox}</w:t>
       </w:r>
@@ -5520,7 +5498,6 @@
           <w:rFonts w:ascii="Segoe UI Symbol" w:hAnsi="Segoe UI Symbol" w:cs="Segoe UI Symbol"/>
           <w:sz w:val="20"/>
           <w:szCs w:val="20"/>
-          <w:highlight w:val="yellow"/>
         </w:rPr>
         <w:t>{part_b_</w:t>
       </w:r>
@@ -5530,7 +5507,6 @@
           <w:rFonts w:ascii="Segoe UI Symbol" w:hAnsi="Segoe UI Symbol" w:cs="Segoe UI Symbol"/>
           <w:sz w:val="20"/>
           <w:szCs w:val="20"/>
-          <w:highlight w:val="yellow"/>
         </w:rPr>
         <w:t>checkbox}</w:t>
       </w:r>
@@ -5665,7 +5641,6 @@
               <w:rPr>
                 <w:sz w:val="20"/>
                 <w:szCs w:val="20"/>
-                <w:highlight w:val="yellow"/>
               </w:rPr>
               <w:t>{financing_limit_rm}</w:t>
             </w:r>
@@ -5938,7 +5913,6 @@
               <w:rPr>
                 <w:sz w:val="20"/>
                 <w:szCs w:val="20"/>
-                <w:highlight w:val="yellow"/>
               </w:rPr>
               <w:t>{max_invoice_tenure_days}</w:t>
             </w:r>
@@ -6622,7 +6596,6 @@
               <w:rPr>
                 <w:sz w:val="20"/>
                 <w:szCs w:val="20"/>
-                <w:highlight w:val="yellow"/>
               </w:rPr>
               <w:t>{part_b_financing_amount_rm}</w:t>
             </w:r>
@@ -6836,7 +6809,6 @@
               <w:rPr>
                 <w:sz w:val="20"/>
                 <w:szCs w:val="20"/>
-                <w:highlight w:val="yellow"/>
               </w:rPr>
               <w:t>{max_invoice_tenure_days}</w:t>
             </w:r>
@@ -7844,7 +7816,6 @@
         <w:rPr>
           <w:sz w:val="20"/>
           <w:szCs w:val="20"/>
-          <w:highlight w:val="yellow"/>
         </w:rPr>
         <w:t>{assigned_contract_date}</w:t>
       </w:r>
@@ -7859,7 +7830,6 @@
         <w:rPr>
           <w:sz w:val="20"/>
           <w:szCs w:val="20"/>
-          <w:highlight w:val="yellow"/>
         </w:rPr>
         <w:t>{assigned_contract_counterparty}</w:t>
       </w:r>
@@ -7874,7 +7844,6 @@
         <w:rPr>
           <w:sz w:val="20"/>
           <w:szCs w:val="20"/>
-          <w:highlight w:val="yellow"/>
         </w:rPr>
         <w:t>{assigned_contract_description}</w:t>
       </w:r>
@@ -8004,7 +7973,6 @@
           <w:bCs/>
           <w:sz w:val="20"/>
           <w:szCs w:val="20"/>
-          <w:highlight w:val="yellow"/>
           <w:u w:val="single"/>
         </w:rPr>
         <w:t>{letter_date}</w:t>
@@ -8046,7 +8014,6 @@
         <w:rPr>
           <w:sz w:val="20"/>
           <w:szCs w:val="20"/>
-          <w:highlight w:val="yellow"/>
         </w:rPr>
         <w:t>{issuer_name}</w:t>
       </w:r>
@@ -8061,7 +8028,6 @@
         <w:rPr>
           <w:sz w:val="20"/>
           <w:szCs w:val="20"/>
-          <w:highlight w:val="yellow"/>
         </w:rPr>
         <w:t>{issuer_registration_number}</w:t>
       </w:r>
@@ -8076,7 +8042,6 @@
         <w:rPr>
           <w:sz w:val="20"/>
           <w:szCs w:val="20"/>
-          <w:highlight w:val="yellow"/>
         </w:rPr>
         <w:t>{issuer_address}</w:t>
       </w:r>
@@ -8091,7 +8056,6 @@
         <w:rPr>
           <w:sz w:val="20"/>
           <w:szCs w:val="20"/>
-          <w:highlight w:val="yellow"/>
         </w:rPr>
         <w:t>{financing_limit_rm}</w:t>
       </w:r>
@@ -8240,7 +8204,6 @@
         <w:rPr>
           <w:sz w:val="20"/>
           <w:szCs w:val="20"/>
-          <w:highlight w:val="yellow"/>
         </w:rPr>
         <w:t>{issuer_name}</w:t>
       </w:r>
@@ -8255,7 +8218,6 @@
         <w:rPr>
           <w:sz w:val="20"/>
           <w:szCs w:val="20"/>
-          <w:highlight w:val="yellow"/>
         </w:rPr>
         <w:t>{issuer_registration_number}</w:t>
       </w:r>
@@ -8392,7 +8354,6 @@
         <w:rPr>
           <w:sz w:val="20"/>
           <w:szCs w:val="20"/>
-          <w:highlight w:val="yellow"/>
         </w:rPr>
         <w:t>{name}</w:t>
       </w:r>
@@ -8417,7 +8378,6 @@
         <w:rPr>
           <w:sz w:val="20"/>
           <w:szCs w:val="20"/>
-          <w:highlight w:val="yellow"/>
         </w:rPr>
         <w:t>{issuer_name}</w:t>
       </w:r>
@@ -8432,7 +8392,6 @@
         <w:rPr>
           <w:sz w:val="20"/>
           <w:szCs w:val="20"/>
-          <w:highlight w:val="yellow"/>
         </w:rPr>
         <w:t>{letter_date}</w:t>
       </w:r>
@@ -8535,7 +8494,6 @@
         <w:rPr>
           <w:sz w:val="20"/>
           <w:szCs w:val="20"/>
-          <w:highlight w:val="yellow"/>
         </w:rPr>
         <w:t>{name}</w:t>
       </w:r>
@@ -8560,7 +8518,6 @@
         <w:rPr>
           <w:sz w:val="20"/>
           <w:szCs w:val="20"/>
-          <w:highlight w:val="yellow"/>
         </w:rPr>
         <w:t>{nric}</w:t>
       </w:r>
@@ -8728,7 +8685,6 @@
         <w:rPr>
           <w:sz w:val="20"/>
           <w:szCs w:val="20"/>
-          <w:highlight w:val="yellow"/>
         </w:rPr>
         <w:t>{company_name}</w:t>
       </w:r>
@@ -8743,7 +8699,6 @@
         <w:rPr>
           <w:sz w:val="20"/>
           <w:szCs w:val="20"/>
-          <w:highlight w:val="yellow"/>
         </w:rPr>
         <w:t>{company_ssm}</w:t>
       </w:r>
@@ -8758,7 +8713,6 @@
         <w:rPr>
           <w:sz w:val="20"/>
           <w:szCs w:val="20"/>
-          <w:highlight w:val="yellow"/>
         </w:rPr>
         <w:t>{issuer_name}</w:t>
       </w:r>
@@ -8773,7 +8727,6 @@
         <w:rPr>
           <w:sz w:val="20"/>
           <w:szCs w:val="20"/>
-          <w:highlight w:val="yellow"/>
         </w:rPr>
         <w:t>{letter_date}</w:t>
       </w:r>
@@ -8873,7 +8826,6 @@
         <w:rPr>
           <w:sz w:val="20"/>
           <w:szCs w:val="20"/>
-          <w:highlight w:val="yellow"/>
         </w:rPr>
         <w:t>{company_name}</w:t>
       </w:r>
@@ -8891,7 +8843,6 @@
         <w:rPr>
           <w:sz w:val="20"/>
           <w:szCs w:val="20"/>
-          <w:highlight w:val="yellow"/>
         </w:rPr>
         <w:t>{company_ssm}</w:t>
       </w:r>
@@ -8980,7 +8931,6 @@
               <w:rPr>
                 <w:sz w:val="20"/>
                 <w:szCs w:val="20"/>
-                <w:highlight w:val="yellow"/>
               </w:rPr>
               <w:t>{left_name}</w:t>
             </w:r>
@@ -9005,7 +8955,6 @@
               <w:rPr>
                 <w:sz w:val="20"/>
                 <w:szCs w:val="20"/>
-                <w:highlight w:val="yellow"/>
               </w:rPr>
               <w:t>{left_nric}</w:t>
             </w:r>
@@ -9098,7 +9047,6 @@
               <w:rPr>
                 <w:sz w:val="20"/>
                 <w:szCs w:val="20"/>
-                <w:highlight w:val="yellow"/>
               </w:rPr>
               <w:t>{right_name}</w:t>
             </w:r>
@@ -9123,7 +9071,6 @@
               <w:rPr>
                 <w:sz w:val="20"/>
                 <w:szCs w:val="20"/>
-                <w:highlight w:val="yellow"/>
               </w:rPr>
               <w:t>{right_nric}</w:t>
             </w:r>

</xml_diff>

<commit_message>
feat: add merge keys for application fee in letter of offer
</commit_message>
<xml_diff>
--- a/apps/api/src/modules/applications/templates/arf-contract-facility-lo.docx
+++ b/apps/api/src/modules/applications/templates/arf-contract-facility-lo.docx
@@ -30,14 +30,7 @@
           <w:szCs w:val="20"/>
         </w:rPr>
         <w:tab/>
-        <w:t xml:space="preserve">: </w:t>
-      </w:r>
-      <w:r>
-        <w:rPr>
-          <w:sz w:val="20"/>
-          <w:szCs w:val="20"/>
-        </w:rPr>
-        <w:t>{issuer_id}</w:t>
+        <w:t>: {issuer_id}</w:t>
       </w:r>
     </w:p>
     <w:p>
@@ -68,14 +61,7 @@
           <w:szCs w:val="20"/>
         </w:rPr>
         <w:tab/>
-        <w:t xml:space="preserve">: </w:t>
-      </w:r>
-      <w:r>
-        <w:rPr>
-          <w:sz w:val="20"/>
-          <w:szCs w:val="20"/>
-        </w:rPr>
-        <w:t>{our_reference}</w:t>
+        <w:t>: {our_reference}</w:t>
       </w:r>
     </w:p>
     <w:p>
@@ -113,21 +99,7 @@
           <w:szCs w:val="20"/>
         </w:rPr>
         <w:tab/>
-        <w:t xml:space="preserve">: </w:t>
-      </w:r>
-      <w:r>
-        <w:rPr>
-          <w:sz w:val="20"/>
-          <w:szCs w:val="20"/>
-        </w:rPr>
-        <w:t>{letter_date}</w:t>
-      </w:r>
-      <w:r>
-        <w:rPr>
-          <w:sz w:val="20"/>
-          <w:szCs w:val="20"/>
-        </w:rPr>
-        <w:t xml:space="preserve">   </w:t>
+        <w:t xml:space="preserve">: {letter_date}   </w:t>
       </w:r>
     </w:p>
     <w:p>
@@ -1578,21 +1550,7 @@
                 <w:sz w:val="20"/>
                 <w:szCs w:val="20"/>
               </w:rPr>
-              <w:t xml:space="preserve">Up to </w:t>
-            </w:r>
-            <w:r>
-              <w:rPr>
-                <w:sz w:val="20"/>
-                <w:szCs w:val="20"/>
-              </w:rPr>
-              <w:t>{tenure_days}</w:t>
-            </w:r>
-            <w:r>
-              <w:rPr>
-                <w:sz w:val="20"/>
-                <w:szCs w:val="20"/>
-              </w:rPr>
-              <w:t xml:space="preserve"> days</w:t>
+              <w:t>Up to {tenure_days} days</w:t>
             </w:r>
           </w:p>
           <w:p>
@@ -3282,21 +3240,7 @@
                 <w:sz w:val="20"/>
                 <w:szCs w:val="20"/>
               </w:rPr>
-              <w:t xml:space="preserve">The Purchase Price shall be payable by the Issuer within such period as may be determined and specified by SSP, being up to a maximum of </w:t>
-            </w:r>
-            <w:r>
-              <w:rPr>
-                <w:sz w:val="20"/>
-                <w:szCs w:val="20"/>
-              </w:rPr>
-              <w:t>{payment_period_days}</w:t>
-            </w:r>
-            <w:r>
-              <w:rPr>
-                <w:sz w:val="20"/>
-                <w:szCs w:val="20"/>
-              </w:rPr>
-              <w:t xml:space="preserve"> days from the date of disbursement, in accordance with the Mode of Payment set out herein.</w:t>
+              <w:t>The Purchase Price shall be payable by the Issuer within such period as may be determined and specified by SSP, being up to a maximum of {payment_period_days} days from the date of disbursement, in accordance with the Mode of Payment set out herein.</w:t>
             </w:r>
           </w:p>
           <w:p>
@@ -3397,35 +3341,7 @@
                 <w:sz w:val="20"/>
                 <w:szCs w:val="20"/>
               </w:rPr>
-              <w:t xml:space="preserve">Period of up to </w:t>
-            </w:r>
-            <w:r>
-              <w:rPr>
-                <w:sz w:val="20"/>
-                <w:szCs w:val="20"/>
-              </w:rPr>
-              <w:t>{grace_period_days}</w:t>
-            </w:r>
-            <w:r>
-              <w:rPr>
-                <w:sz w:val="20"/>
-                <w:szCs w:val="20"/>
-              </w:rPr>
-              <w:t xml:space="preserve"> (</w:t>
-            </w:r>
-            <w:r>
-              <w:rPr>
-                <w:sz w:val="20"/>
-                <w:szCs w:val="20"/>
-              </w:rPr>
-              <w:t>{grace_period_days_words}</w:t>
-            </w:r>
-            <w:r>
-              <w:rPr>
-                <w:sz w:val="20"/>
-                <w:szCs w:val="20"/>
-              </w:rPr>
-              <w:t>) days after the payment due date.</w:t>
+              <w:t>Period of up to {grace_period_days} ({grace_period_days_words}) days after the payment due date.</w:t>
             </w:r>
           </w:p>
           <w:p>
@@ -4804,35 +4720,7 @@
                 <w:sz w:val="20"/>
                 <w:szCs w:val="20"/>
               </w:rPr>
-              <w:t xml:space="preserve">All Transaction Documents are to be executed by the Issuer within </w:t>
-            </w:r>
-            <w:r>
-              <w:rPr>
-                <w:sz w:val="20"/>
-                <w:szCs w:val="20"/>
-              </w:rPr>
-              <w:t>{transaction_docs_days}</w:t>
-            </w:r>
-            <w:r>
-              <w:rPr>
-                <w:sz w:val="20"/>
-                <w:szCs w:val="20"/>
-              </w:rPr>
-              <w:t xml:space="preserve"> (</w:t>
-            </w:r>
-            <w:r>
-              <w:rPr>
-                <w:sz w:val="20"/>
-                <w:szCs w:val="20"/>
-              </w:rPr>
-              <w:t>{transaction_docs_days_words}</w:t>
-            </w:r>
-            <w:r>
-              <w:rPr>
-                <w:sz w:val="20"/>
-                <w:szCs w:val="20"/>
-              </w:rPr>
-              <w:t xml:space="preserve">) days’ from acceptance of the Letter of Offer, failing which the offer for the Facility will be revoked and cancelled, unless otherwise extended in writing by SSP. </w:t>
+              <w:t xml:space="preserve">All Transaction Documents are to be executed by the Issuer within {transaction_docs_days} ({transaction_docs_days_words}) days’ from acceptance of the Letter of Offer, failing which the offer for the Facility will be revoked and cancelled, unless otherwise extended in writing by SSP. </w:t>
             </w:r>
           </w:p>
           <w:p>
@@ -5068,21 +4956,7 @@
           <w:sz w:val="20"/>
           <w:szCs w:val="20"/>
         </w:rPr>
-        <w:t xml:space="preserve">This offer shall lapse automatically after </w:t>
-      </w:r>
-      <w:r>
-        <w:rPr>
-          <w:sz w:val="20"/>
-          <w:szCs w:val="20"/>
-        </w:rPr>
-        <w:t>{offer_validity_phrase}</w:t>
-      </w:r>
-      <w:r>
-        <w:rPr>
-          <w:sz w:val="20"/>
-          <w:szCs w:val="20"/>
-        </w:rPr>
-        <w:t xml:space="preserve"> from the date of this Facility Offer unless the validity period is extended in writing by SSP.</w:t>
+        <w:t>This offer shall lapse automatically after {offer_validity_phrase} from the date of this Facility Offer unless the validity period is extended in writing by SSP.</w:t>
       </w:r>
     </w:p>
     <w:p>
@@ -5277,21 +5151,7 @@
           <w:sz w:val="20"/>
           <w:szCs w:val="20"/>
         </w:rPr>
-        <w:t xml:space="preserve">Should the terms and conditions outlined above be agreeable to you, kindly signify your acceptance by signing the Memorandum of Acceptance and the Acknowledgement and Consent by Guarantors within </w:t>
-      </w:r>
-      <w:r>
-        <w:rPr>
-          <w:sz w:val="20"/>
-          <w:szCs w:val="20"/>
-        </w:rPr>
-        <w:t>{offer_validity_phrase}</w:t>
-      </w:r>
-      <w:r>
-        <w:rPr>
-          <w:sz w:val="20"/>
-          <w:szCs w:val="20"/>
-        </w:rPr>
-        <w:t xml:space="preserve"> from the date of this letter. Failure to do so will result in the offer being void, unless a written extension is provided by SSP.</w:t>
+        <w:t>Should the terms and conditions outlined above be agreeable to you, kindly signify your acceptance by signing the Memorandum of Acceptance and the Acknowledgement and Consent by Guarantors within {offer_validity_phrase} from the date of this letter. Failure to do so will result in the offer being void, unless a written extension is provided by SSP.</w:t>
       </w:r>
     </w:p>
     <w:p>
@@ -5461,69 +5321,35 @@
           <w:sz w:val="20"/>
           <w:szCs w:val="20"/>
         </w:rPr>
-        <w:t>{part_a_</w:t>
-      </w:r>
-      <w:proofErr w:type="gramStart"/>
+        <w:t>{part_a_checkbox}</w:t>
+      </w:r>
+      <w:r>
+        <w:rPr>
+          <w:sz w:val="20"/>
+          <w:szCs w:val="20"/>
+        </w:rPr>
+        <w:t xml:space="preserve">  Part A – Contract-Based Facility (revolving)     </w:t>
+      </w:r>
+    </w:p>
+    <w:p>
+      <w:pPr>
+        <w:spacing w:line="360" w:lineRule="auto"/>
+        <w:jc w:val="both"/>
+      </w:pPr>
       <w:r>
         <w:rPr>
           <w:rFonts w:ascii="Segoe UI Symbol" w:hAnsi="Segoe UI Symbol" w:cs="Segoe UI Symbol"/>
           <w:sz w:val="20"/>
           <w:szCs w:val="20"/>
         </w:rPr>
-        <w:t>checkbox}</w:t>
-      </w:r>
-      <w:r>
-        <w:rPr>
-          <w:sz w:val="20"/>
-          <w:szCs w:val="20"/>
-        </w:rPr>
-        <w:t xml:space="preserve">  Part</w:t>
-      </w:r>
-      <w:proofErr w:type="gramEnd"/>
-      <w:r>
-        <w:rPr>
-          <w:sz w:val="20"/>
-          <w:szCs w:val="20"/>
-        </w:rPr>
-        <w:t xml:space="preserve"> A – Contract-Based Facility (revolving)     </w:t>
-      </w:r>
-    </w:p>
-    <w:p>
-      <w:pPr>
-        <w:spacing w:line="360" w:lineRule="auto"/>
-        <w:jc w:val="both"/>
-      </w:pPr>
-      <w:r>
-        <w:rPr>
-          <w:rFonts w:ascii="Segoe UI Symbol" w:hAnsi="Segoe UI Symbol" w:cs="Segoe UI Symbol"/>
-          <w:sz w:val="20"/>
-          <w:szCs w:val="20"/>
-        </w:rPr>
-        <w:t>{part_b_</w:t>
-      </w:r>
-      <w:proofErr w:type="gramStart"/>
-      <w:r>
-        <w:rPr>
-          <w:rFonts w:ascii="Segoe UI Symbol" w:hAnsi="Segoe UI Symbol" w:cs="Segoe UI Symbol"/>
-          <w:sz w:val="20"/>
-          <w:szCs w:val="20"/>
-        </w:rPr>
-        <w:t>checkbox}</w:t>
-      </w:r>
-      <w:r>
-        <w:rPr>
-          <w:sz w:val="20"/>
-          <w:szCs w:val="20"/>
-        </w:rPr>
-        <w:t xml:space="preserve">  Part</w:t>
-      </w:r>
-      <w:proofErr w:type="gramEnd"/>
-      <w:r>
-        <w:rPr>
-          <w:sz w:val="20"/>
-          <w:szCs w:val="20"/>
-        </w:rPr>
-        <w:t xml:space="preserve"> B </w:t>
+        <w:t>{part_b_checkbox}</w:t>
+      </w:r>
+      <w:r>
+        <w:rPr>
+          <w:sz w:val="20"/>
+          <w:szCs w:val="20"/>
+        </w:rPr>
+        <w:t xml:space="preserve">  Part B </w:t>
       </w:r>
       <w:r>
         <w:rPr>
@@ -5789,6 +5615,7 @@
                 <w:sz w:val="20"/>
                 <w:szCs w:val="20"/>
               </w:rPr>
+              <w:lastRenderedPageBreak/>
               <w:t>Profit Rate</w:t>
             </w:r>
           </w:p>
@@ -5821,23 +5648,8 @@
                 <w:sz w:val="20"/>
                 <w:szCs w:val="20"/>
               </w:rPr>
-              <w:t xml:space="preserve">To be determined by the Operator upon utilisation of the financing, not exceeding eighteen per cent (18%) per annum, and subject </w:t>
-            </w:r>
-            <w:proofErr w:type="gramStart"/>
-            <w:r>
-              <w:rPr>
-                <w:sz w:val="20"/>
-                <w:szCs w:val="20"/>
-              </w:rPr>
-              <w:t>at all times</w:t>
-            </w:r>
-            <w:proofErr w:type="gramEnd"/>
-            <w:r>
-              <w:rPr>
-                <w:sz w:val="20"/>
-                <w:szCs w:val="20"/>
-              </w:rPr>
-              <w:t xml:space="preserve"> to the Balance Margin of Financing.</w:t>
+              <w:lastRenderedPageBreak/>
+              <w:t>To be determined by the Operator upon utilisation of the financing, not exceeding eighteen per cent (18%) per annum, and subject at all times to the Balance Margin of Financing.</w:t>
             </w:r>
           </w:p>
           <w:p>
@@ -5907,21 +5719,7 @@
                 <w:sz w:val="20"/>
                 <w:szCs w:val="20"/>
               </w:rPr>
-              <w:t xml:space="preserve">Minimum 30 days up to a maximum of </w:t>
-            </w:r>
-            <w:r>
-              <w:rPr>
-                <w:sz w:val="20"/>
-                <w:szCs w:val="20"/>
-              </w:rPr>
-              <w:t>{max_invoice_tenure_days}</w:t>
-            </w:r>
-            <w:r>
-              <w:rPr>
-                <w:sz w:val="20"/>
-                <w:szCs w:val="20"/>
-              </w:rPr>
-              <w:t xml:space="preserve"> days, in increments of 15 days.</w:t>
+              <w:t>Minimum 30 days up to a maximum of {max_invoice_tenure_days} days, in increments of 15 days.</w:t>
             </w:r>
           </w:p>
           <w:p>
@@ -6118,14 +5916,7 @@
                 <w:sz w:val="20"/>
                 <w:szCs w:val="20"/>
               </w:rPr>
-              <w:t>RM</w:t>
-            </w:r>
-            <w:r>
-              <w:rPr>
-                <w:sz w:val="20"/>
-                <w:szCs w:val="20"/>
-              </w:rPr>
-              <w:t>150</w:t>
+              <w:t>{application_fee_rm}</w:t>
             </w:r>
             <w:r>
               <w:rPr>
@@ -6392,7 +6183,6 @@
                 <w:sz w:val="20"/>
                 <w:szCs w:val="20"/>
               </w:rPr>
-              <w:lastRenderedPageBreak/>
               <w:t xml:space="preserve">All fees constitute </w:t>
             </w:r>
             <w:proofErr w:type="spellStart"/>
@@ -6453,6 +6243,7 @@
           <w:szCs w:val="20"/>
           <w:u w:val="single"/>
         </w:rPr>
+        <w:lastRenderedPageBreak/>
         <w:t>PART B — INVOICE-BASED FINANCING (SINGLE INVOICE)</w:t>
       </w:r>
     </w:p>
@@ -6590,21 +6381,7 @@
                 <w:sz w:val="20"/>
                 <w:szCs w:val="20"/>
               </w:rPr>
-              <w:t xml:space="preserve">Up to </w:t>
-            </w:r>
-            <w:r>
-              <w:rPr>
-                <w:sz w:val="20"/>
-                <w:szCs w:val="20"/>
-              </w:rPr>
-              <w:t>{part_b_financing_amount_rm}</w:t>
-            </w:r>
-            <w:r>
-              <w:rPr>
-                <w:sz w:val="20"/>
-                <w:szCs w:val="20"/>
-              </w:rPr>
-              <w:t xml:space="preserve"> per invoice, being up to eighty per cent (80%) of the invoice value and not exceeding the Maximum Financing Margin.</w:t>
+              <w:t>Up to {part_b_financing_amount_rm} per invoice, being up to eighty per cent (80%) of the invoice value and not exceeding the Maximum Financing Margin.</w:t>
             </w:r>
           </w:p>
         </w:tc>
@@ -6738,23 +6515,7 @@
                 <w:sz w:val="20"/>
                 <w:szCs w:val="20"/>
               </w:rPr>
-              <w:t xml:space="preserve">To be determined by the Operator upon utilisation of the financing, not exceeding eighteen per cent (18%) per annum, and subject </w:t>
-            </w:r>
-            <w:proofErr w:type="gramStart"/>
-            <w:r>
-              <w:rPr>
-                <w:sz w:val="20"/>
-                <w:szCs w:val="20"/>
-              </w:rPr>
-              <w:t>at all times</w:t>
-            </w:r>
-            <w:proofErr w:type="gramEnd"/>
-            <w:r>
-              <w:rPr>
-                <w:sz w:val="20"/>
-                <w:szCs w:val="20"/>
-              </w:rPr>
-              <w:t xml:space="preserve"> to the Balance Margin of Financing.</w:t>
+              <w:t>To be determined by the Operator upon utilisation of the financing, not exceeding eighteen per cent (18%) per annum, and subject at all times to the Balance Margin of Financing.</w:t>
             </w:r>
           </w:p>
           <w:p>
@@ -6803,21 +6564,7 @@
                 <w:sz w:val="20"/>
                 <w:szCs w:val="20"/>
               </w:rPr>
-              <w:t xml:space="preserve">Minimum 30 days up to a maximum of </w:t>
-            </w:r>
-            <w:r>
-              <w:rPr>
-                <w:sz w:val="20"/>
-                <w:szCs w:val="20"/>
-              </w:rPr>
-              <w:t>{max_invoice_tenure_days}</w:t>
-            </w:r>
-            <w:r>
-              <w:rPr>
-                <w:sz w:val="20"/>
-                <w:szCs w:val="20"/>
-              </w:rPr>
-              <w:t xml:space="preserve"> days, in increments of 15 days.</w:t>
+              <w:t>Minimum 30 days up to a maximum of {max_invoice_tenure_days} days, in increments of 15 days.</w:t>
             </w:r>
           </w:p>
         </w:tc>
@@ -6842,7 +6589,6 @@
                 <w:sz w:val="20"/>
                 <w:szCs w:val="20"/>
               </w:rPr>
-              <w:lastRenderedPageBreak/>
               <w:t>Drawdowns</w:t>
             </w:r>
           </w:p>
@@ -6960,6 +6706,7 @@
                 <w:sz w:val="20"/>
                 <w:szCs w:val="20"/>
               </w:rPr>
+              <w:lastRenderedPageBreak/>
               <w:t>Application Fee</w:t>
             </w:r>
           </w:p>
@@ -6982,21 +6729,14 @@
                 <w:sz w:val="20"/>
                 <w:szCs w:val="20"/>
               </w:rPr>
-              <w:t>RM</w:t>
+              <w:t>{application_fee_rm}</w:t>
             </w:r>
             <w:r>
               <w:rPr>
                 <w:sz w:val="20"/>
                 <w:szCs w:val="20"/>
               </w:rPr>
-              <w:t>1</w:t>
-            </w:r>
-            <w:r>
-              <w:rPr>
-                <w:sz w:val="20"/>
-                <w:szCs w:val="20"/>
-              </w:rPr>
-              <w:t>50, payable on application.</w:t>
+              <w:t>, payable on application.</w:t>
             </w:r>
           </w:p>
         </w:tc>
@@ -7384,7 +7124,6 @@
                 <w:sz w:val="20"/>
                 <w:szCs w:val="20"/>
               </w:rPr>
-              <w:lastRenderedPageBreak/>
               <w:t>Eligible Receivables</w:t>
             </w:r>
           </w:p>
@@ -7413,24 +7152,7 @@
                 <w:sz w:val="20"/>
                 <w:szCs w:val="20"/>
               </w:rPr>
-              <w:lastRenderedPageBreak/>
-              <w:t xml:space="preserve">Only receivables which satisfy </w:t>
-            </w:r>
-            <w:proofErr w:type="gramStart"/>
-            <w:r>
-              <w:rPr>
-                <w:sz w:val="20"/>
-                <w:szCs w:val="20"/>
-              </w:rPr>
-              <w:t>all of</w:t>
-            </w:r>
-            <w:proofErr w:type="gramEnd"/>
-            <w:r>
-              <w:rPr>
-                <w:sz w:val="20"/>
-                <w:szCs w:val="20"/>
-              </w:rPr>
-              <w:t xml:space="preserve"> the following criteria shall be eligible for financing under this Facility:</w:t>
+              <w:t>Only receivables which satisfy all of the following criteria shall be eligible for financing under this Facility:</w:t>
             </w:r>
           </w:p>
           <w:p>
@@ -7481,6 +7203,7 @@
                 <w:sz w:val="20"/>
                 <w:szCs w:val="20"/>
               </w:rPr>
+              <w:lastRenderedPageBreak/>
               <w:t>the receivable is not subject to any prior assignment, charge, encumbrance or restriction;</w:t>
             </w:r>
           </w:p>
@@ -7810,49 +7533,7 @@
           <w:sz w:val="20"/>
           <w:szCs w:val="20"/>
         </w:rPr>
-        <w:t xml:space="preserve">the contract dated </w:t>
-      </w:r>
-      <w:r>
-        <w:rPr>
-          <w:sz w:val="20"/>
-          <w:szCs w:val="20"/>
-        </w:rPr>
-        <w:t>{assigned_contract_date}</w:t>
-      </w:r>
-      <w:r>
-        <w:rPr>
-          <w:sz w:val="20"/>
-          <w:szCs w:val="20"/>
-        </w:rPr>
-        <w:t xml:space="preserve"> between </w:t>
-      </w:r>
-      <w:r>
-        <w:rPr>
-          <w:sz w:val="20"/>
-          <w:szCs w:val="20"/>
-        </w:rPr>
-        <w:t>{assigned_contract_counterparty}</w:t>
-      </w:r>
-      <w:r>
-        <w:rPr>
-          <w:sz w:val="20"/>
-          <w:szCs w:val="20"/>
-        </w:rPr>
-        <w:t xml:space="preserve"> and the Issuer for the </w:t>
-      </w:r>
-      <w:r>
-        <w:rPr>
-          <w:sz w:val="20"/>
-          <w:szCs w:val="20"/>
-        </w:rPr>
-        <w:t>{assigned_contract_description}</w:t>
-      </w:r>
-      <w:r>
-        <w:rPr>
-          <w:sz w:val="20"/>
-          <w:szCs w:val="20"/>
-        </w:rPr>
-        <w:t xml:space="preserve"> (“Contract 1”); and</w:t>
+        <w:t>the contract dated {assigned_contract_date} between {assigned_contract_counterparty} and the Issuer for the {assigned_contract_description} (“Contract 1”); and</w:t>
       </w:r>
     </w:p>
     <w:p>
@@ -7965,9 +7646,13 @@
           <w:szCs w:val="20"/>
           <w:u w:val="single"/>
         </w:rPr>
-        <w:t xml:space="preserve">RE : LETTER OF OFFER ON ACCOUNT RECEIVABLE FINANCING-i (“FACILITY”) DATED </w:t>
-      </w:r>
-      <w:r>
+        <w:t>RE : LETTER OF OFFER ON ACCOUNT RECEIVABLE FINANCING-i (“FACILITY”) DATED {letter_date}</w:t>
+      </w:r>
+    </w:p>
+    <w:p>
+      <w:pPr>
+        <w:spacing w:line="360" w:lineRule="auto"/>
+        <w:jc w:val="both"/>
         <w:rPr>
           <w:b/>
           <w:bCs/>
@@ -7975,8 +7660,7 @@
           <w:szCs w:val="20"/>
           <w:u w:val="single"/>
         </w:rPr>
-        <w:t>{letter_date}</w:t>
-      </w:r>
+      </w:pPr>
     </w:p>
     <w:p>
       <w:pPr>
@@ -7990,81 +7674,12 @@
           <w:u w:val="single"/>
         </w:rPr>
       </w:pPr>
-    </w:p>
-    <w:p>
-      <w:pPr>
-        <w:spacing w:line="360" w:lineRule="auto"/>
-        <w:jc w:val="both"/>
-        <w:rPr>
-          <w:b/>
-          <w:bCs/>
-          <w:sz w:val="20"/>
-          <w:szCs w:val="20"/>
-          <w:u w:val="single"/>
-        </w:rPr>
-      </w:pPr>
-      <w:r>
-        <w:rPr>
-          <w:sz w:val="20"/>
-          <w:szCs w:val="20"/>
-        </w:rPr>
-        <w:t xml:space="preserve">We, </w:t>
-      </w:r>
-      <w:r>
-        <w:rPr>
-          <w:sz w:val="20"/>
-          <w:szCs w:val="20"/>
-        </w:rPr>
-        <w:t>{issuer_name}</w:t>
-      </w:r>
-      <w:r>
-        <w:rPr>
-          <w:sz w:val="20"/>
-          <w:szCs w:val="20"/>
-        </w:rPr>
-        <w:t xml:space="preserve"> (Registration No.: </w:t>
-      </w:r>
-      <w:r>
-        <w:rPr>
-          <w:sz w:val="20"/>
-          <w:szCs w:val="20"/>
-        </w:rPr>
-        <w:t>{issuer_registration_number}</w:t>
-      </w:r>
-      <w:r>
-        <w:rPr>
-          <w:sz w:val="20"/>
-          <w:szCs w:val="20"/>
-        </w:rPr>
-        <w:t xml:space="preserve"> having a registered address at </w:t>
-      </w:r>
-      <w:r>
-        <w:rPr>
-          <w:sz w:val="20"/>
-          <w:szCs w:val="20"/>
-        </w:rPr>
-        <w:t>{issuer_address}</w:t>
-      </w:r>
-      <w:r>
-        <w:rPr>
-          <w:sz w:val="20"/>
-          <w:szCs w:val="20"/>
-        </w:rPr>
-        <w:t xml:space="preserve"> hereby confirm our acceptance of the offer of the Financing Facility of </w:t>
-      </w:r>
-      <w:r>
-        <w:rPr>
-          <w:sz w:val="20"/>
-          <w:szCs w:val="20"/>
-        </w:rPr>
-        <w:t>{financing_limit_rm}</w:t>
-      </w:r>
-      <w:r>
-        <w:rPr>
-          <w:sz w:val="20"/>
-          <w:szCs w:val="20"/>
-        </w:rPr>
-        <w:t xml:space="preserve"> ("the Facility") based upon the terms as set out above and/or and in the Schedule(s) of the Letter of Offer and/or may appear in the Transaction Documents to be executed pursuant to the Facility.</w:t>
+      <w:r>
+        <w:rPr>
+          <w:sz w:val="20"/>
+          <w:szCs w:val="20"/>
+        </w:rPr>
+        <w:t>We, {issuer_name} (Registration No.: {issuer_registration_number} having a registered address at {issuer_address} hereby confirm our acceptance of the offer of the Financing Facility of {financing_limit_rm} ("the Facility") based upon the terms as set out above and/or and in the Schedule(s) of the Letter of Offer and/or may appear in the Transaction Documents to be executed pursuant to the Facility.</w:t>
       </w:r>
     </w:p>
     <w:p>
@@ -8205,28 +7820,7 @@
           <w:sz w:val="20"/>
           <w:szCs w:val="20"/>
         </w:rPr>
-        <w:t>{issuer_name}</w:t>
-      </w:r>
-      <w:r>
-        <w:rPr>
-          <w:sz w:val="20"/>
-          <w:szCs w:val="20"/>
-        </w:rPr>
-        <w:t xml:space="preserve"> (Company No. </w:t>
-      </w:r>
-      <w:r>
-        <w:rPr>
-          <w:sz w:val="20"/>
-          <w:szCs w:val="20"/>
-        </w:rPr>
-        <w:t>{issuer_registration_number}</w:t>
-      </w:r>
-      <w:r>
-        <w:rPr>
-          <w:sz w:val="20"/>
-          <w:szCs w:val="20"/>
-        </w:rPr>
-        <w:t>)</w:t>
+        <w:t>{issuer_name} (Company No. {issuer_registration_number})</w:t>
       </w:r>
     </w:p>
     <w:p>
@@ -8372,59 +7966,24 @@
           <w:sz w:val="20"/>
           <w:szCs w:val="20"/>
         </w:rPr>
-        <w:t xml:space="preserve">being the Guarantors in respect of the Facility by SHORAKA SUYULA PLATFORM SDN BHD (Reg. No : 202101033028 (1433328-H)) to </w:t>
-      </w:r>
-      <w:r>
-        <w:rPr>
-          <w:sz w:val="20"/>
-          <w:szCs w:val="20"/>
-        </w:rPr>
-        <w:t>{issuer_name}</w:t>
-      </w:r>
-      <w:r>
-        <w:rPr>
-          <w:sz w:val="20"/>
-          <w:szCs w:val="20"/>
-        </w:rPr>
-        <w:t xml:space="preserve"> hereby agree to the terms and conditions stated in this Letter of Offer dated </w:t>
-      </w:r>
-      <w:r>
-        <w:rPr>
-          <w:sz w:val="20"/>
-          <w:szCs w:val="20"/>
-        </w:rPr>
-        <w:t>{letter_date}</w:t>
-      </w:r>
-      <w:r>
-        <w:rPr>
-          <w:sz w:val="20"/>
-          <w:szCs w:val="20"/>
-        </w:rPr>
-        <w:t>.</w:t>
-      </w:r>
-    </w:p>
-    <w:p>
-      <w:pPr>
-        <w:spacing w:line="360" w:lineRule="auto"/>
-        <w:jc w:val="both"/>
-        <w:rPr>
-          <w:sz w:val="20"/>
-          <w:szCs w:val="20"/>
-        </w:rPr>
-      </w:pPr>
-      <w:r>
-        <w:rPr>
-          <w:sz w:val="20"/>
-          <w:szCs w:val="20"/>
-        </w:rPr>
-        <w:t xml:space="preserve">For the avoidance of doubt, the obligations and liabilities of the Guarantors under this Letter of Offer shall be further set out in a Guarantee Agreement to be executed by the Guarantors in favour of Shoraka Suyula Platform Sdn. Bhd. (Reg. No : 202101033028 (1433328-H)). The Guarantors expressly acknowledge and agree that the execution of such Guarantee Agreement shall constitute a condition precedent to the disbursement of the Facility and that the detailed terms, covenants and undertakings therein shall </w:t>
-      </w:r>
-      <w:r>
-        <w:rPr>
-          <w:sz w:val="20"/>
-          <w:szCs w:val="20"/>
-        </w:rPr>
-        <w:t>prevail and be binding upon the Guarantors in addition to the provisions of this Letter of Offer.</w:t>
+        <w:t>being the Guarantors in respect of the Facility by SHORAKA SUYULA PLATFORM SDN BHD (Reg. No : 202101033028 (1433328-H)) to {issuer_name} hereby agree to the terms and conditions stated in this Letter of Offer dated {letter_date}.</w:t>
+      </w:r>
+    </w:p>
+    <w:p>
+      <w:pPr>
+        <w:spacing w:line="360" w:lineRule="auto"/>
+        <w:jc w:val="both"/>
+        <w:rPr>
+          <w:sz w:val="20"/>
+          <w:szCs w:val="20"/>
+        </w:rPr>
+      </w:pPr>
+      <w:r>
+        <w:rPr>
+          <w:sz w:val="20"/>
+          <w:szCs w:val="20"/>
+        </w:rPr>
+        <w:t>For the avoidance of doubt, the obligations and liabilities of the Guarantors under this Letter of Offer shall be further set out in a Guarantee Agreement to be executed by the Guarantors in favour of Shoraka Suyula Platform Sdn. Bhd. (Reg. No : 202101033028 (1433328-H)). The Guarantors expressly acknowledge and agree that the execution of such Guarantee Agreement shall constitute a condition precedent to the disbursement of the Facility and that the detailed terms, covenants and undertakings therein shall prevail and be binding upon the Guarantors in addition to the provisions of this Letter of Offer.</w:t>
       </w:r>
     </w:p>
     <w:p>
@@ -8512,14 +8071,7 @@
           <w:sz w:val="20"/>
           <w:szCs w:val="20"/>
         </w:rPr>
-        <w:t xml:space="preserve">NRIC : </w:t>
-      </w:r>
-      <w:r>
-        <w:rPr>
-          <w:sz w:val="20"/>
-          <w:szCs w:val="20"/>
-        </w:rPr>
-        <w:t>{nric}</w:t>
+        <w:t>NRIC : {nric}</w:t>
       </w:r>
     </w:p>
     <w:p>
@@ -8679,87 +8231,24 @@
           <w:sz w:val="20"/>
           <w:szCs w:val="20"/>
         </w:rPr>
-        <w:t xml:space="preserve">We, </w:t>
-      </w:r>
-      <w:r>
-        <w:rPr>
-          <w:sz w:val="20"/>
-          <w:szCs w:val="20"/>
-        </w:rPr>
-        <w:t>{company_name}</w:t>
-      </w:r>
-      <w:r>
-        <w:rPr>
-          <w:sz w:val="20"/>
-          <w:szCs w:val="20"/>
-        </w:rPr>
-        <w:t xml:space="preserve"> (Registration No. </w:t>
-      </w:r>
-      <w:r>
-        <w:rPr>
-          <w:sz w:val="20"/>
-          <w:szCs w:val="20"/>
-        </w:rPr>
-        <w:t>{company_ssm}</w:t>
-      </w:r>
-      <w:r>
-        <w:rPr>
-          <w:sz w:val="20"/>
-          <w:szCs w:val="20"/>
-        </w:rPr>
-        <w:t xml:space="preserve">) being the Guarantor in respect of the Facility by SHORAKA SUYULA PLATFORM SDN BHD (Reg. No : 202101033028 (1433328-H)) to </w:t>
-      </w:r>
-      <w:r>
-        <w:rPr>
-          <w:sz w:val="20"/>
-          <w:szCs w:val="20"/>
-        </w:rPr>
-        <w:t>{issuer_name}</w:t>
-      </w:r>
-      <w:r>
-        <w:rPr>
-          <w:sz w:val="20"/>
-          <w:szCs w:val="20"/>
-        </w:rPr>
-        <w:t xml:space="preserve"> hereby agree to the terms and conditions stated in this Letter of Offer dated </w:t>
-      </w:r>
-      <w:r>
-        <w:rPr>
-          <w:sz w:val="20"/>
-          <w:szCs w:val="20"/>
-        </w:rPr>
-        <w:t>{letter_date}</w:t>
-      </w:r>
-      <w:r>
-        <w:rPr>
-          <w:sz w:val="20"/>
-          <w:szCs w:val="20"/>
-        </w:rPr>
-        <w:t>.</w:t>
-      </w:r>
-    </w:p>
-    <w:p>
-      <w:pPr>
-        <w:spacing w:line="360" w:lineRule="auto"/>
-        <w:jc w:val="both"/>
-        <w:rPr>
-          <w:sz w:val="20"/>
-          <w:szCs w:val="20"/>
-        </w:rPr>
-      </w:pPr>
-      <w:r>
-        <w:rPr>
-          <w:sz w:val="20"/>
-          <w:szCs w:val="20"/>
-        </w:rPr>
-        <w:t xml:space="preserve">For the avoidance of doubt, the obligations and liabilities of the Guarantors under this Letter of Offer shall be further set out in a Guarantee Agreement to be executed by the Guarantors in favour of Shoraka Suyula Platform Sdn. Bhd. (Reg. No : 202101033028 (1433328-H)). The Guarantors expressly acknowledge and agree that the execution of such Guarantee Agreement shall constitute a condition precedent to the disbursement of the Facility and that the detailed terms, covenants and undertakings therein shall </w:t>
-      </w:r>
-      <w:r>
-        <w:rPr>
-          <w:sz w:val="20"/>
-          <w:szCs w:val="20"/>
-        </w:rPr>
-        <w:t>prevail and be binding upon the Guarantors in addition to the provisions of this Letter of Offer.</w:t>
+        <w:t>We, {company_name} (Registration No. {company_ssm}) being the Guarantor in respect of the Facility by SHORAKA SUYULA PLATFORM SDN BHD (Reg. No : 202101033028 (1433328-H)) to {issuer_name} hereby agree to the terms and conditions stated in this Letter of Offer dated {letter_date}.</w:t>
+      </w:r>
+    </w:p>
+    <w:p>
+      <w:pPr>
+        <w:spacing w:line="360" w:lineRule="auto"/>
+        <w:jc w:val="both"/>
+        <w:rPr>
+          <w:sz w:val="20"/>
+          <w:szCs w:val="20"/>
+        </w:rPr>
+      </w:pPr>
+      <w:r>
+        <w:rPr>
+          <w:sz w:val="20"/>
+          <w:szCs w:val="20"/>
+        </w:rPr>
+        <w:t>For the avoidance of doubt, the obligations and liabilities of the Guarantors under this Letter of Offer shall be further set out in a Guarantee Agreement to be executed by the Guarantors in favour of Shoraka Suyula Platform Sdn. Bhd. (Reg. No : 202101033028 (1433328-H)). The Guarantors expressly acknowledge and agree that the execution of such Guarantee Agreement shall constitute a condition precedent to the disbursement of the Facility and that the detailed terms, covenants and undertakings therein shall prevail and be binding upon the Guarantors in addition to the provisions of this Letter of Offer.</w:t>
       </w:r>
     </w:p>
     <w:p>
@@ -8820,14 +8309,7 @@
           <w:sz w:val="20"/>
           <w:szCs w:val="20"/>
         </w:rPr>
-        <w:t xml:space="preserve">For and on behalf of </w:t>
-      </w:r>
-      <w:r>
-        <w:rPr>
-          <w:sz w:val="20"/>
-          <w:szCs w:val="20"/>
-        </w:rPr>
-        <w:t>{company_name}</w:t>
+        <w:t>For and on behalf of {company_name}</w:t>
       </w:r>
     </w:p>
     <w:p>
@@ -8949,14 +8431,7 @@
                 <w:sz w:val="20"/>
                 <w:szCs w:val="20"/>
               </w:rPr>
-              <w:t xml:space="preserve">NRIC : </w:t>
-            </w:r>
-            <w:r>
-              <w:rPr>
-                <w:sz w:val="20"/>
-                <w:szCs w:val="20"/>
-              </w:rPr>
-              <w:t>{left_nric}</w:t>
+              <w:t>NRIC : {left_nric}</w:t>
             </w:r>
           </w:p>
           <w:p>
@@ -9065,14 +8540,7 @@
                 <w:sz w:val="20"/>
                 <w:szCs w:val="20"/>
               </w:rPr>
-              <w:t xml:space="preserve">NRIC : </w:t>
-            </w:r>
-            <w:r>
-              <w:rPr>
-                <w:sz w:val="20"/>
-                <w:szCs w:val="20"/>
-              </w:rPr>
-              <w:t>{right_nric}</w:t>
+              <w:t>NRIC : {right_nric}</w:t>
             </w:r>
           </w:p>
           <w:p>
@@ -9126,7 +8594,6 @@
           <w:sz w:val="20"/>
           <w:szCs w:val="20"/>
         </w:rPr>
-        <w:lastRenderedPageBreak/>
         <w:t>{/corporate_guarantor_pages}</w:t>
       </w:r>
     </w:p>
@@ -9711,23 +9178,7 @@
           <w:sz w:val="20"/>
           <w:szCs w:val="20"/>
         </w:rPr>
-        <w:t xml:space="preserve">Active Account Management: Operate your account in a fully active and satisfactory manner, ensuring that the approved Financing Limit (for a Part A Contract-Based Facility) and the terms of each Investment Note are </w:t>
-      </w:r>
-      <w:proofErr w:type="gramStart"/>
-      <w:r>
-        <w:rPr>
-          <w:sz w:val="20"/>
-          <w:szCs w:val="20"/>
-        </w:rPr>
-        <w:t>observed at all times</w:t>
-      </w:r>
-      <w:proofErr w:type="gramEnd"/>
-      <w:r>
-        <w:rPr>
-          <w:sz w:val="20"/>
-          <w:szCs w:val="20"/>
-        </w:rPr>
-        <w:t>.</w:t>
+        <w:t>Active Account Management: Operate your account in a fully active and satisfactory manner, ensuring that the approved Financing Limit (for a Part A Contract-Based Facility) and the terms of each Investment Note are observed at all times.</w:t>
       </w:r>
     </w:p>
     <w:p>
@@ -23804,6 +23255,19 @@
 </file>
 
 <file path=customXml/item1.xml><?xml version="1.0" encoding="utf-8"?>
+<?mso-contentType ?>
+<FormTemplates xmlns="http://schemas.microsoft.com/sharepoint/v3/contenttype/forms">
+  <Display>DocumentLibraryForm</Display>
+  <Edit>DocumentLibraryForm</Edit>
+  <New>DocumentLibraryForm</New>
+</FormTemplates>
+</file>
+
+<file path=customXml/item2.xml><?xml version="1.0" encoding="utf-8"?>
+<b:Sources xmlns:b="http://schemas.openxmlformats.org/officeDocument/2006/bibliography" xmlns="http://schemas.openxmlformats.org/officeDocument/2006/bibliography" SelectedStyle="\APASixthEditionOfficeOnline.xsl" StyleName="APA" Version="6"/>
+</file>
+
+<file path=customXml/item3.xml><?xml version="1.0" encoding="utf-8"?>
 <p:properties xmlns:p="http://schemas.microsoft.com/office/2006/metadata/properties" xmlns:xsi="http://www.w3.org/2001/XMLSchema-instance" xmlns:pc="http://schemas.microsoft.com/office/infopath/2007/PartnerControls">
   <documentManagement>
     <_Flow_SignoffStatus xmlns="a0846abc-da76-433d-b89e-11ed84fbaeb3" xsi:nil="true"/>
@@ -23813,19 +23277,6 @@
     <TaxCatchAll xmlns="4b0b2adc-e4a8-4832-bb38-e3a7e820179b" xsi:nil="true"/>
   </documentManagement>
 </p:properties>
-</file>
-
-<file path=customXml/item2.xml><?xml version="1.0" encoding="utf-8"?>
-<b:Sources xmlns:b="http://schemas.openxmlformats.org/officeDocument/2006/bibliography" xmlns="http://schemas.openxmlformats.org/officeDocument/2006/bibliography" SelectedStyle="\APASixthEditionOfficeOnline.xsl" StyleName="APA" Version="6"/>
-</file>
-
-<file path=customXml/item3.xml><?xml version="1.0" encoding="utf-8"?>
-<?mso-contentType ?>
-<FormTemplates xmlns="http://schemas.microsoft.com/sharepoint/v3/contenttype/forms">
-  <Display>DocumentLibraryForm</Display>
-  <Edit>DocumentLibraryForm</Edit>
-  <New>DocumentLibraryForm</New>
-</FormTemplates>
 </file>
 
 <file path=customXml/item4.xml><?xml version="1.0" encoding="utf-8"?>
@@ -24096,12 +23547,9 @@
 </file>
 
 <file path=customXml/itemProps1.xml><?xml version="1.0" encoding="utf-8"?>
-<ds:datastoreItem xmlns:ds="http://schemas.openxmlformats.org/officeDocument/2006/customXml" ds:itemID="{06AF3FC3-CD02-49E6-93A5-73EE653BBDCC}">
+<ds:datastoreItem xmlns:ds="http://schemas.openxmlformats.org/officeDocument/2006/customXml" ds:itemID="{B3B23335-743F-4ECA-B591-0D88F7E33FD2}">
   <ds:schemaRefs>
-    <ds:schemaRef ds:uri="http://schemas.microsoft.com/office/2006/metadata/properties"/>
-    <ds:schemaRef ds:uri="http://schemas.microsoft.com/office/infopath/2007/PartnerControls"/>
-    <ds:schemaRef ds:uri="a0846abc-da76-433d-b89e-11ed84fbaeb3"/>
-    <ds:schemaRef ds:uri="4b0b2adc-e4a8-4832-bb38-e3a7e820179b"/>
+    <ds:schemaRef ds:uri="http://schemas.microsoft.com/sharepoint/v3/contenttype/forms"/>
   </ds:schemaRefs>
 </ds:datastoreItem>
 </file>
@@ -24115,9 +23563,12 @@
 </file>
 
 <file path=customXml/itemProps3.xml><?xml version="1.0" encoding="utf-8"?>
-<ds:datastoreItem xmlns:ds="http://schemas.openxmlformats.org/officeDocument/2006/customXml" ds:itemID="{B3B23335-743F-4ECA-B591-0D88F7E33FD2}">
+<ds:datastoreItem xmlns:ds="http://schemas.openxmlformats.org/officeDocument/2006/customXml" ds:itemID="{06AF3FC3-CD02-49E6-93A5-73EE653BBDCC}">
   <ds:schemaRefs>
-    <ds:schemaRef ds:uri="http://schemas.microsoft.com/sharepoint/v3/contenttype/forms"/>
+    <ds:schemaRef ds:uri="http://schemas.microsoft.com/office/2006/metadata/properties"/>
+    <ds:schemaRef ds:uri="http://schemas.microsoft.com/office/infopath/2007/PartnerControls"/>
+    <ds:schemaRef ds:uri="a0846abc-da76-433d-b89e-11ed84fbaeb3"/>
+    <ds:schemaRef ds:uri="4b0b2adc-e4a8-4832-bb38-e3a7e820179b"/>
   </ds:schemaRefs>
 </ds:datastoreItem>
 </file>

</xml_diff>

<commit_message>
feat: supporting documents can only be amended if flagged
- Updated DoA - wrong level in address from 17 -> 19
- Updated LO - missing closing parenthesis
</commit_message>
<xml_diff>
--- a/apps/api/src/modules/applications/templates/arf-contract-facility-lo.docx
+++ b/apps/api/src/modules/applications/templates/arf-contract-facility-lo.docx
@@ -217,7 +217,6 @@
           <w:tab w:val="left" w:pos="2160"/>
         </w:tabs>
         <w:ind w:left="2160" w:hanging="2160"/>
-        <w:jc w:val="left"/>
         <w:rPr>
           <w:sz w:val="20"/>
           <w:szCs w:val="20"/>
@@ -236,20 +235,13 @@
           <w:szCs w:val="20"/>
         </w:rPr>
         <w:tab/>
-      </w:r>
-      <w:r>
-        <w:rPr>
-          <w:sz w:val="20"/>
-          <w:szCs w:val="20"/>
-        </w:rPr>
         <w:t>{attention_name}</w:t>
       </w:r>
     </w:p>
     <w:p>
       <w:pPr>
-        <w:ind w:left="1440"/>
-        <w:jc w:val="left"/>
         <w:spacing w:after="0" w:line="360" w:lineRule="auto"/>
+        <w:ind w:left="1440" w:firstLine="720"/>
         <w:rPr>
           <w:sz w:val="20"/>
           <w:szCs w:val="20"/>
@@ -5916,14 +5908,7 @@
                 <w:sz w:val="20"/>
                 <w:szCs w:val="20"/>
               </w:rPr>
-              <w:t>{application_fee_rm}</w:t>
-            </w:r>
-            <w:r>
-              <w:rPr>
-                <w:sz w:val="20"/>
-                <w:szCs w:val="20"/>
-              </w:rPr>
-              <w:t>, payable on application.</w:t>
+              <w:t>{application_fee_rm}, payable on application.</w:t>
             </w:r>
           </w:p>
         </w:tc>
@@ -6185,7 +6170,6 @@
               </w:rPr>
               <w:t xml:space="preserve">All fees constitute </w:t>
             </w:r>
-            <w:proofErr w:type="spellStart"/>
             <w:r>
               <w:rPr>
                 <w:i/>
@@ -6195,7 +6179,6 @@
               </w:rPr>
               <w:t>ujrah</w:t>
             </w:r>
-            <w:proofErr w:type="spellEnd"/>
             <w:r>
               <w:rPr>
                 <w:sz w:val="20"/>
@@ -6729,14 +6712,7 @@
                 <w:sz w:val="20"/>
                 <w:szCs w:val="20"/>
               </w:rPr>
-              <w:t>{application_fee_rm}</w:t>
-            </w:r>
-            <w:r>
-              <w:rPr>
-                <w:sz w:val="20"/>
-                <w:szCs w:val="20"/>
-              </w:rPr>
-              <w:t>, payable on application.</w:t>
+              <w:t>{application_fee_rm}, payable on application.</w:t>
             </w:r>
           </w:p>
         </w:tc>
@@ -6941,7 +6917,6 @@
               </w:rPr>
               <w:t xml:space="preserve">All fees constitute </w:t>
             </w:r>
-            <w:proofErr w:type="spellStart"/>
             <w:r>
               <w:rPr>
                 <w:i/>
@@ -6951,7 +6926,6 @@
               </w:rPr>
               <w:t>ujrah</w:t>
             </w:r>
-            <w:proofErr w:type="spellEnd"/>
             <w:r>
               <w:rPr>
                 <w:sz w:val="20"/>
@@ -7679,7 +7653,21 @@
           <w:sz w:val="20"/>
           <w:szCs w:val="20"/>
         </w:rPr>
-        <w:t>We, {issuer_name} (Registration No.: {issuer_registration_number} having a registered address at {issuer_address} hereby confirm our acceptance of the offer of the Financing Facility of {financing_limit_rm} ("the Facility") based upon the terms as set out above and/or and in the Schedule(s) of the Letter of Offer and/or may appear in the Transaction Documents to be executed pursuant to the Facility.</w:t>
+        <w:t>We, {issuer_name} (Registration No.: {issuer_registration_number}</w:t>
+      </w:r>
+      <w:r>
+        <w:rPr>
+          <w:sz w:val="20"/>
+          <w:szCs w:val="20"/>
+        </w:rPr>
+        <w:t>)</w:t>
+      </w:r>
+      <w:r>
+        <w:rPr>
+          <w:sz w:val="20"/>
+          <w:szCs w:val="20"/>
+        </w:rPr>
+        <w:t xml:space="preserve"> having a registered address at {issuer_address} hereby confirm our acceptance of the offer of the Financing Facility of {financing_limit_rm} ("the Facility") based upon the terms as set out above and/or and in the Schedule(s) of the Letter of Offer and/or may appear in the Transaction Documents to be executed pursuant to the Facility.</w:t>
       </w:r>
     </w:p>
     <w:p>
@@ -23255,19 +23243,6 @@
 </file>
 
 <file path=customXml/item1.xml><?xml version="1.0" encoding="utf-8"?>
-<?mso-contentType ?>
-<FormTemplates xmlns="http://schemas.microsoft.com/sharepoint/v3/contenttype/forms">
-  <Display>DocumentLibraryForm</Display>
-  <Edit>DocumentLibraryForm</Edit>
-  <New>DocumentLibraryForm</New>
-</FormTemplates>
-</file>
-
-<file path=customXml/item2.xml><?xml version="1.0" encoding="utf-8"?>
-<b:Sources xmlns:b="http://schemas.openxmlformats.org/officeDocument/2006/bibliography" xmlns="http://schemas.openxmlformats.org/officeDocument/2006/bibliography" SelectedStyle="\APASixthEditionOfficeOnline.xsl" StyleName="APA" Version="6"/>
-</file>
-
-<file path=customXml/item3.xml><?xml version="1.0" encoding="utf-8"?>
 <p:properties xmlns:p="http://schemas.microsoft.com/office/2006/metadata/properties" xmlns:xsi="http://www.w3.org/2001/XMLSchema-instance" xmlns:pc="http://schemas.microsoft.com/office/infopath/2007/PartnerControls">
   <documentManagement>
     <_Flow_SignoffStatus xmlns="a0846abc-da76-433d-b89e-11ed84fbaeb3" xsi:nil="true"/>
@@ -23277,6 +23252,19 @@
     <TaxCatchAll xmlns="4b0b2adc-e4a8-4832-bb38-e3a7e820179b" xsi:nil="true"/>
   </documentManagement>
 </p:properties>
+</file>
+
+<file path=customXml/item2.xml><?xml version="1.0" encoding="utf-8"?>
+<b:Sources xmlns:b="http://schemas.openxmlformats.org/officeDocument/2006/bibliography" xmlns="http://schemas.openxmlformats.org/officeDocument/2006/bibliography" SelectedStyle="\APASixthEditionOfficeOnline.xsl" StyleName="APA" Version="6"/>
+</file>
+
+<file path=customXml/item3.xml><?xml version="1.0" encoding="utf-8"?>
+<?mso-contentType ?>
+<FormTemplates xmlns="http://schemas.microsoft.com/sharepoint/v3/contenttype/forms">
+  <Display>DocumentLibraryForm</Display>
+  <Edit>DocumentLibraryForm</Edit>
+  <New>DocumentLibraryForm</New>
+</FormTemplates>
 </file>
 
 <file path=customXml/item4.xml><?xml version="1.0" encoding="utf-8"?>
@@ -23547,9 +23535,12 @@
 </file>
 
 <file path=customXml/itemProps1.xml><?xml version="1.0" encoding="utf-8"?>
-<ds:datastoreItem xmlns:ds="http://schemas.openxmlformats.org/officeDocument/2006/customXml" ds:itemID="{B3B23335-743F-4ECA-B591-0D88F7E33FD2}">
+<ds:datastoreItem xmlns:ds="http://schemas.openxmlformats.org/officeDocument/2006/customXml" ds:itemID="{06AF3FC3-CD02-49E6-93A5-73EE653BBDCC}">
   <ds:schemaRefs>
-    <ds:schemaRef ds:uri="http://schemas.microsoft.com/sharepoint/v3/contenttype/forms"/>
+    <ds:schemaRef ds:uri="http://schemas.microsoft.com/office/2006/metadata/properties"/>
+    <ds:schemaRef ds:uri="http://schemas.microsoft.com/office/infopath/2007/PartnerControls"/>
+    <ds:schemaRef ds:uri="a0846abc-da76-433d-b89e-11ed84fbaeb3"/>
+    <ds:schemaRef ds:uri="4b0b2adc-e4a8-4832-bb38-e3a7e820179b"/>
   </ds:schemaRefs>
 </ds:datastoreItem>
 </file>
@@ -23563,12 +23554,9 @@
 </file>
 
 <file path=customXml/itemProps3.xml><?xml version="1.0" encoding="utf-8"?>
-<ds:datastoreItem xmlns:ds="http://schemas.openxmlformats.org/officeDocument/2006/customXml" ds:itemID="{06AF3FC3-CD02-49E6-93A5-73EE653BBDCC}">
+<ds:datastoreItem xmlns:ds="http://schemas.openxmlformats.org/officeDocument/2006/customXml" ds:itemID="{B3B23335-743F-4ECA-B591-0D88F7E33FD2}">
   <ds:schemaRefs>
-    <ds:schemaRef ds:uri="http://schemas.microsoft.com/office/2006/metadata/properties"/>
-    <ds:schemaRef ds:uri="http://schemas.microsoft.com/office/infopath/2007/PartnerControls"/>
-    <ds:schemaRef ds:uri="a0846abc-da76-433d-b89e-11ed84fbaeb3"/>
-    <ds:schemaRef ds:uri="4b0b2adc-e4a8-4832-bb38-e3a7e820179b"/>
+    <ds:schemaRef ds:uri="http://schemas.microsoft.com/sharepoint/v3/contenttype/forms"/>
   </ds:schemaRefs>
 </ds:datastoreItem>
 </file>

</xml_diff>

<commit_message>
Fix/minor fixes 3 (#360)
* feat: add merge keys for application fee in letter of offer

* feat: allow individual guarantor details to be amended through authorized representative page

* feat: supporting documents can only be amended if flagged

- Updated DoA - wrong level in address from 17 -> 19
- Updated LO - missing closing parenthesis
</commit_message>
<xml_diff>
--- a/apps/api/src/modules/applications/templates/arf-contract-facility-lo.docx
+++ b/apps/api/src/modules/applications/templates/arf-contract-facility-lo.docx
@@ -30,14 +30,7 @@
           <w:szCs w:val="20"/>
         </w:rPr>
         <w:tab/>
-        <w:t xml:space="preserve">: </w:t>
-      </w:r>
-      <w:r>
-        <w:rPr>
-          <w:sz w:val="20"/>
-          <w:szCs w:val="20"/>
-        </w:rPr>
-        <w:t>{issuer_id}</w:t>
+        <w:t>: {issuer_id}</w:t>
       </w:r>
     </w:p>
     <w:p>
@@ -68,14 +61,7 @@
           <w:szCs w:val="20"/>
         </w:rPr>
         <w:tab/>
-        <w:t xml:space="preserve">: </w:t>
-      </w:r>
-      <w:r>
-        <w:rPr>
-          <w:sz w:val="20"/>
-          <w:szCs w:val="20"/>
-        </w:rPr>
-        <w:t>{our_reference}</w:t>
+        <w:t>: {our_reference}</w:t>
       </w:r>
     </w:p>
     <w:p>
@@ -113,21 +99,7 @@
           <w:szCs w:val="20"/>
         </w:rPr>
         <w:tab/>
-        <w:t xml:space="preserve">: </w:t>
-      </w:r>
-      <w:r>
-        <w:rPr>
-          <w:sz w:val="20"/>
-          <w:szCs w:val="20"/>
-        </w:rPr>
-        <w:t>{letter_date}</w:t>
-      </w:r>
-      <w:r>
-        <w:rPr>
-          <w:sz w:val="20"/>
-          <w:szCs w:val="20"/>
-        </w:rPr>
-        <w:t xml:space="preserve">   </w:t>
+        <w:t xml:space="preserve">: {letter_date}   </w:t>
       </w:r>
     </w:p>
     <w:p>
@@ -245,7 +217,6 @@
           <w:tab w:val="left" w:pos="2160"/>
         </w:tabs>
         <w:ind w:left="2160" w:hanging="2160"/>
-        <w:jc w:val="left"/>
         <w:rPr>
           <w:sz w:val="20"/>
           <w:szCs w:val="20"/>
@@ -264,20 +235,13 @@
           <w:szCs w:val="20"/>
         </w:rPr>
         <w:tab/>
-      </w:r>
-      <w:r>
-        <w:rPr>
-          <w:sz w:val="20"/>
-          <w:szCs w:val="20"/>
-        </w:rPr>
         <w:t>{attention_name}</w:t>
       </w:r>
     </w:p>
     <w:p>
       <w:pPr>
-        <w:ind w:left="1440"/>
-        <w:jc w:val="left"/>
         <w:spacing w:after="0" w:line="360" w:lineRule="auto"/>
+        <w:ind w:left="1440" w:firstLine="720"/>
         <w:rPr>
           <w:sz w:val="20"/>
           <w:szCs w:val="20"/>
@@ -1578,21 +1542,7 @@
                 <w:sz w:val="20"/>
                 <w:szCs w:val="20"/>
               </w:rPr>
-              <w:t xml:space="preserve">Up to </w:t>
-            </w:r>
-            <w:r>
-              <w:rPr>
-                <w:sz w:val="20"/>
-                <w:szCs w:val="20"/>
-              </w:rPr>
-              <w:t>{tenure_days}</w:t>
-            </w:r>
-            <w:r>
-              <w:rPr>
-                <w:sz w:val="20"/>
-                <w:szCs w:val="20"/>
-              </w:rPr>
-              <w:t xml:space="preserve"> days</w:t>
+              <w:t>Up to {tenure_days} days</w:t>
             </w:r>
           </w:p>
           <w:p>
@@ -3282,21 +3232,7 @@
                 <w:sz w:val="20"/>
                 <w:szCs w:val="20"/>
               </w:rPr>
-              <w:t xml:space="preserve">The Purchase Price shall be payable by the Issuer within such period as may be determined and specified by SSP, being up to a maximum of </w:t>
-            </w:r>
-            <w:r>
-              <w:rPr>
-                <w:sz w:val="20"/>
-                <w:szCs w:val="20"/>
-              </w:rPr>
-              <w:t>{payment_period_days}</w:t>
-            </w:r>
-            <w:r>
-              <w:rPr>
-                <w:sz w:val="20"/>
-                <w:szCs w:val="20"/>
-              </w:rPr>
-              <w:t xml:space="preserve"> days from the date of disbursement, in accordance with the Mode of Payment set out herein.</w:t>
+              <w:t>The Purchase Price shall be payable by the Issuer within such period as may be determined and specified by SSP, being up to a maximum of {payment_period_days} days from the date of disbursement, in accordance with the Mode of Payment set out herein.</w:t>
             </w:r>
           </w:p>
           <w:p>
@@ -3397,35 +3333,7 @@
                 <w:sz w:val="20"/>
                 <w:szCs w:val="20"/>
               </w:rPr>
-              <w:t xml:space="preserve">Period of up to </w:t>
-            </w:r>
-            <w:r>
-              <w:rPr>
-                <w:sz w:val="20"/>
-                <w:szCs w:val="20"/>
-              </w:rPr>
-              <w:t>{grace_period_days}</w:t>
-            </w:r>
-            <w:r>
-              <w:rPr>
-                <w:sz w:val="20"/>
-                <w:szCs w:val="20"/>
-              </w:rPr>
-              <w:t xml:space="preserve"> (</w:t>
-            </w:r>
-            <w:r>
-              <w:rPr>
-                <w:sz w:val="20"/>
-                <w:szCs w:val="20"/>
-              </w:rPr>
-              <w:t>{grace_period_days_words}</w:t>
-            </w:r>
-            <w:r>
-              <w:rPr>
-                <w:sz w:val="20"/>
-                <w:szCs w:val="20"/>
-              </w:rPr>
-              <w:t>) days after the payment due date.</w:t>
+              <w:t>Period of up to {grace_period_days} ({grace_period_days_words}) days after the payment due date.</w:t>
             </w:r>
           </w:p>
           <w:p>
@@ -4804,35 +4712,7 @@
                 <w:sz w:val="20"/>
                 <w:szCs w:val="20"/>
               </w:rPr>
-              <w:t xml:space="preserve">All Transaction Documents are to be executed by the Issuer within </w:t>
-            </w:r>
-            <w:r>
-              <w:rPr>
-                <w:sz w:val="20"/>
-                <w:szCs w:val="20"/>
-              </w:rPr>
-              <w:t>{transaction_docs_days}</w:t>
-            </w:r>
-            <w:r>
-              <w:rPr>
-                <w:sz w:val="20"/>
-                <w:szCs w:val="20"/>
-              </w:rPr>
-              <w:t xml:space="preserve"> (</w:t>
-            </w:r>
-            <w:r>
-              <w:rPr>
-                <w:sz w:val="20"/>
-                <w:szCs w:val="20"/>
-              </w:rPr>
-              <w:t>{transaction_docs_days_words}</w:t>
-            </w:r>
-            <w:r>
-              <w:rPr>
-                <w:sz w:val="20"/>
-                <w:szCs w:val="20"/>
-              </w:rPr>
-              <w:t xml:space="preserve">) days’ from acceptance of the Letter of Offer, failing which the offer for the Facility will be revoked and cancelled, unless otherwise extended in writing by SSP. </w:t>
+              <w:t xml:space="preserve">All Transaction Documents are to be executed by the Issuer within {transaction_docs_days} ({transaction_docs_days_words}) days’ from acceptance of the Letter of Offer, failing which the offer for the Facility will be revoked and cancelled, unless otherwise extended in writing by SSP. </w:t>
             </w:r>
           </w:p>
           <w:p>
@@ -5068,21 +4948,7 @@
           <w:sz w:val="20"/>
           <w:szCs w:val="20"/>
         </w:rPr>
-        <w:t xml:space="preserve">This offer shall lapse automatically after </w:t>
-      </w:r>
-      <w:r>
-        <w:rPr>
-          <w:sz w:val="20"/>
-          <w:szCs w:val="20"/>
-        </w:rPr>
-        <w:t>{offer_validity_phrase}</w:t>
-      </w:r>
-      <w:r>
-        <w:rPr>
-          <w:sz w:val="20"/>
-          <w:szCs w:val="20"/>
-        </w:rPr>
-        <w:t xml:space="preserve"> from the date of this Facility Offer unless the validity period is extended in writing by SSP.</w:t>
+        <w:t>This offer shall lapse automatically after {offer_validity_phrase} from the date of this Facility Offer unless the validity period is extended in writing by SSP.</w:t>
       </w:r>
     </w:p>
     <w:p>
@@ -5277,21 +5143,7 @@
           <w:sz w:val="20"/>
           <w:szCs w:val="20"/>
         </w:rPr>
-        <w:t xml:space="preserve">Should the terms and conditions outlined above be agreeable to you, kindly signify your acceptance by signing the Memorandum of Acceptance and the Acknowledgement and Consent by Guarantors within </w:t>
-      </w:r>
-      <w:r>
-        <w:rPr>
-          <w:sz w:val="20"/>
-          <w:szCs w:val="20"/>
-        </w:rPr>
-        <w:t>{offer_validity_phrase}</w:t>
-      </w:r>
-      <w:r>
-        <w:rPr>
-          <w:sz w:val="20"/>
-          <w:szCs w:val="20"/>
-        </w:rPr>
-        <w:t xml:space="preserve"> from the date of this letter. Failure to do so will result in the offer being void, unless a written extension is provided by SSP.</w:t>
+        <w:t>Should the terms and conditions outlined above be agreeable to you, kindly signify your acceptance by signing the Memorandum of Acceptance and the Acknowledgement and Consent by Guarantors within {offer_validity_phrase} from the date of this letter. Failure to do so will result in the offer being void, unless a written extension is provided by SSP.</w:t>
       </w:r>
     </w:p>
     <w:p>
@@ -5461,69 +5313,35 @@
           <w:sz w:val="20"/>
           <w:szCs w:val="20"/>
         </w:rPr>
-        <w:t>{part_a_</w:t>
-      </w:r>
-      <w:proofErr w:type="gramStart"/>
+        <w:t>{part_a_checkbox}</w:t>
+      </w:r>
+      <w:r>
+        <w:rPr>
+          <w:sz w:val="20"/>
+          <w:szCs w:val="20"/>
+        </w:rPr>
+        <w:t xml:space="preserve">  Part A – Contract-Based Facility (revolving)     </w:t>
+      </w:r>
+    </w:p>
+    <w:p>
+      <w:pPr>
+        <w:spacing w:line="360" w:lineRule="auto"/>
+        <w:jc w:val="both"/>
+      </w:pPr>
       <w:r>
         <w:rPr>
           <w:rFonts w:ascii="Segoe UI Symbol" w:hAnsi="Segoe UI Symbol" w:cs="Segoe UI Symbol"/>
           <w:sz w:val="20"/>
           <w:szCs w:val="20"/>
         </w:rPr>
-        <w:t>checkbox}</w:t>
-      </w:r>
-      <w:r>
-        <w:rPr>
-          <w:sz w:val="20"/>
-          <w:szCs w:val="20"/>
-        </w:rPr>
-        <w:t xml:space="preserve">  Part</w:t>
-      </w:r>
-      <w:proofErr w:type="gramEnd"/>
-      <w:r>
-        <w:rPr>
-          <w:sz w:val="20"/>
-          <w:szCs w:val="20"/>
-        </w:rPr>
-        <w:t xml:space="preserve"> A – Contract-Based Facility (revolving)     </w:t>
-      </w:r>
-    </w:p>
-    <w:p>
-      <w:pPr>
-        <w:spacing w:line="360" w:lineRule="auto"/>
-        <w:jc w:val="both"/>
-      </w:pPr>
-      <w:r>
-        <w:rPr>
-          <w:rFonts w:ascii="Segoe UI Symbol" w:hAnsi="Segoe UI Symbol" w:cs="Segoe UI Symbol"/>
-          <w:sz w:val="20"/>
-          <w:szCs w:val="20"/>
-        </w:rPr>
-        <w:t>{part_b_</w:t>
-      </w:r>
-      <w:proofErr w:type="gramStart"/>
-      <w:r>
-        <w:rPr>
-          <w:rFonts w:ascii="Segoe UI Symbol" w:hAnsi="Segoe UI Symbol" w:cs="Segoe UI Symbol"/>
-          <w:sz w:val="20"/>
-          <w:szCs w:val="20"/>
-        </w:rPr>
-        <w:t>checkbox}</w:t>
-      </w:r>
-      <w:r>
-        <w:rPr>
-          <w:sz w:val="20"/>
-          <w:szCs w:val="20"/>
-        </w:rPr>
-        <w:t xml:space="preserve">  Part</w:t>
-      </w:r>
-      <w:proofErr w:type="gramEnd"/>
-      <w:r>
-        <w:rPr>
-          <w:sz w:val="20"/>
-          <w:szCs w:val="20"/>
-        </w:rPr>
-        <w:t xml:space="preserve"> B </w:t>
+        <w:t>{part_b_checkbox}</w:t>
+      </w:r>
+      <w:r>
+        <w:rPr>
+          <w:sz w:val="20"/>
+          <w:szCs w:val="20"/>
+        </w:rPr>
+        <w:t xml:space="preserve">  Part B </w:t>
       </w:r>
       <w:r>
         <w:rPr>
@@ -5789,6 +5607,7 @@
                 <w:sz w:val="20"/>
                 <w:szCs w:val="20"/>
               </w:rPr>
+              <w:lastRenderedPageBreak/>
               <w:t>Profit Rate</w:t>
             </w:r>
           </w:p>
@@ -5821,23 +5640,8 @@
                 <w:sz w:val="20"/>
                 <w:szCs w:val="20"/>
               </w:rPr>
-              <w:t xml:space="preserve">To be determined by the Operator upon utilisation of the financing, not exceeding eighteen per cent (18%) per annum, and subject </w:t>
-            </w:r>
-            <w:proofErr w:type="gramStart"/>
-            <w:r>
-              <w:rPr>
-                <w:sz w:val="20"/>
-                <w:szCs w:val="20"/>
-              </w:rPr>
-              <w:t>at all times</w:t>
-            </w:r>
-            <w:proofErr w:type="gramEnd"/>
-            <w:r>
-              <w:rPr>
-                <w:sz w:val="20"/>
-                <w:szCs w:val="20"/>
-              </w:rPr>
-              <w:t xml:space="preserve"> to the Balance Margin of Financing.</w:t>
+              <w:lastRenderedPageBreak/>
+              <w:t>To be determined by the Operator upon utilisation of the financing, not exceeding eighteen per cent (18%) per annum, and subject at all times to the Balance Margin of Financing.</w:t>
             </w:r>
           </w:p>
           <w:p>
@@ -5907,21 +5711,7 @@
                 <w:sz w:val="20"/>
                 <w:szCs w:val="20"/>
               </w:rPr>
-              <w:t xml:space="preserve">Minimum 30 days up to a maximum of </w:t>
-            </w:r>
-            <w:r>
-              <w:rPr>
-                <w:sz w:val="20"/>
-                <w:szCs w:val="20"/>
-              </w:rPr>
-              <w:t>{max_invoice_tenure_days}</w:t>
-            </w:r>
-            <w:r>
-              <w:rPr>
-                <w:sz w:val="20"/>
-                <w:szCs w:val="20"/>
-              </w:rPr>
-              <w:t xml:space="preserve"> days, in increments of 15 days.</w:t>
+              <w:t>Minimum 30 days up to a maximum of {max_invoice_tenure_days} days, in increments of 15 days.</w:t>
             </w:r>
           </w:p>
           <w:p>
@@ -6118,21 +5908,7 @@
                 <w:sz w:val="20"/>
                 <w:szCs w:val="20"/>
               </w:rPr>
-              <w:t>RM</w:t>
-            </w:r>
-            <w:r>
-              <w:rPr>
-                <w:sz w:val="20"/>
-                <w:szCs w:val="20"/>
-              </w:rPr>
-              <w:t>150</w:t>
-            </w:r>
-            <w:r>
-              <w:rPr>
-                <w:sz w:val="20"/>
-                <w:szCs w:val="20"/>
-              </w:rPr>
-              <w:t>, payable on application.</w:t>
+              <w:t>{application_fee_rm}, payable on application.</w:t>
             </w:r>
           </w:p>
         </w:tc>
@@ -6392,10 +6168,8 @@
                 <w:sz w:val="20"/>
                 <w:szCs w:val="20"/>
               </w:rPr>
-              <w:lastRenderedPageBreak/>
               <w:t xml:space="preserve">All fees constitute </w:t>
             </w:r>
-            <w:proofErr w:type="spellStart"/>
             <w:r>
               <w:rPr>
                 <w:i/>
@@ -6405,7 +6179,6 @@
               </w:rPr>
               <w:t>ujrah</w:t>
             </w:r>
-            <w:proofErr w:type="spellEnd"/>
             <w:r>
               <w:rPr>
                 <w:sz w:val="20"/>
@@ -6453,6 +6226,7 @@
           <w:szCs w:val="20"/>
           <w:u w:val="single"/>
         </w:rPr>
+        <w:lastRenderedPageBreak/>
         <w:t>PART B — INVOICE-BASED FINANCING (SINGLE INVOICE)</w:t>
       </w:r>
     </w:p>
@@ -6590,21 +6364,7 @@
                 <w:sz w:val="20"/>
                 <w:szCs w:val="20"/>
               </w:rPr>
-              <w:t xml:space="preserve">Up to </w:t>
-            </w:r>
-            <w:r>
-              <w:rPr>
-                <w:sz w:val="20"/>
-                <w:szCs w:val="20"/>
-              </w:rPr>
-              <w:t>{part_b_financing_amount_rm}</w:t>
-            </w:r>
-            <w:r>
-              <w:rPr>
-                <w:sz w:val="20"/>
-                <w:szCs w:val="20"/>
-              </w:rPr>
-              <w:t xml:space="preserve"> per invoice, being up to eighty per cent (80%) of the invoice value and not exceeding the Maximum Financing Margin.</w:t>
+              <w:t>Up to {part_b_financing_amount_rm} per invoice, being up to eighty per cent (80%) of the invoice value and not exceeding the Maximum Financing Margin.</w:t>
             </w:r>
           </w:p>
         </w:tc>
@@ -6738,23 +6498,7 @@
                 <w:sz w:val="20"/>
                 <w:szCs w:val="20"/>
               </w:rPr>
-              <w:t xml:space="preserve">To be determined by the Operator upon utilisation of the financing, not exceeding eighteen per cent (18%) per annum, and subject </w:t>
-            </w:r>
-            <w:proofErr w:type="gramStart"/>
-            <w:r>
-              <w:rPr>
-                <w:sz w:val="20"/>
-                <w:szCs w:val="20"/>
-              </w:rPr>
-              <w:t>at all times</w:t>
-            </w:r>
-            <w:proofErr w:type="gramEnd"/>
-            <w:r>
-              <w:rPr>
-                <w:sz w:val="20"/>
-                <w:szCs w:val="20"/>
-              </w:rPr>
-              <w:t xml:space="preserve"> to the Balance Margin of Financing.</w:t>
+              <w:t>To be determined by the Operator upon utilisation of the financing, not exceeding eighteen per cent (18%) per annum, and subject at all times to the Balance Margin of Financing.</w:t>
             </w:r>
           </w:p>
           <w:p>
@@ -6803,21 +6547,7 @@
                 <w:sz w:val="20"/>
                 <w:szCs w:val="20"/>
               </w:rPr>
-              <w:t xml:space="preserve">Minimum 30 days up to a maximum of </w:t>
-            </w:r>
-            <w:r>
-              <w:rPr>
-                <w:sz w:val="20"/>
-                <w:szCs w:val="20"/>
-              </w:rPr>
-              <w:t>{max_invoice_tenure_days}</w:t>
-            </w:r>
-            <w:r>
-              <w:rPr>
-                <w:sz w:val="20"/>
-                <w:szCs w:val="20"/>
-              </w:rPr>
-              <w:t xml:space="preserve"> days, in increments of 15 days.</w:t>
+              <w:t>Minimum 30 days up to a maximum of {max_invoice_tenure_days} days, in increments of 15 days.</w:t>
             </w:r>
           </w:p>
         </w:tc>
@@ -6842,7 +6572,6 @@
                 <w:sz w:val="20"/>
                 <w:szCs w:val="20"/>
               </w:rPr>
-              <w:lastRenderedPageBreak/>
               <w:t>Drawdowns</w:t>
             </w:r>
           </w:p>
@@ -6960,6 +6689,7 @@
                 <w:sz w:val="20"/>
                 <w:szCs w:val="20"/>
               </w:rPr>
+              <w:lastRenderedPageBreak/>
               <w:t>Application Fee</w:t>
             </w:r>
           </w:p>
@@ -6982,21 +6712,7 @@
                 <w:sz w:val="20"/>
                 <w:szCs w:val="20"/>
               </w:rPr>
-              <w:t>RM</w:t>
-            </w:r>
-            <w:r>
-              <w:rPr>
-                <w:sz w:val="20"/>
-                <w:szCs w:val="20"/>
-              </w:rPr>
-              <w:t>1</w:t>
-            </w:r>
-            <w:r>
-              <w:rPr>
-                <w:sz w:val="20"/>
-                <w:szCs w:val="20"/>
-              </w:rPr>
-              <w:t>50, payable on application.</w:t>
+              <w:t>{application_fee_rm}, payable on application.</w:t>
             </w:r>
           </w:p>
         </w:tc>
@@ -7201,7 +6917,6 @@
               </w:rPr>
               <w:t xml:space="preserve">All fees constitute </w:t>
             </w:r>
-            <w:proofErr w:type="spellStart"/>
             <w:r>
               <w:rPr>
                 <w:i/>
@@ -7211,7 +6926,6 @@
               </w:rPr>
               <w:t>ujrah</w:t>
             </w:r>
-            <w:proofErr w:type="spellEnd"/>
             <w:r>
               <w:rPr>
                 <w:sz w:val="20"/>
@@ -7384,7 +7098,6 @@
                 <w:sz w:val="20"/>
                 <w:szCs w:val="20"/>
               </w:rPr>
-              <w:lastRenderedPageBreak/>
               <w:t>Eligible Receivables</w:t>
             </w:r>
           </w:p>
@@ -7413,24 +7126,7 @@
                 <w:sz w:val="20"/>
                 <w:szCs w:val="20"/>
               </w:rPr>
-              <w:lastRenderedPageBreak/>
-              <w:t xml:space="preserve">Only receivables which satisfy </w:t>
-            </w:r>
-            <w:proofErr w:type="gramStart"/>
-            <w:r>
-              <w:rPr>
-                <w:sz w:val="20"/>
-                <w:szCs w:val="20"/>
-              </w:rPr>
-              <w:t>all of</w:t>
-            </w:r>
-            <w:proofErr w:type="gramEnd"/>
-            <w:r>
-              <w:rPr>
-                <w:sz w:val="20"/>
-                <w:szCs w:val="20"/>
-              </w:rPr>
-              <w:t xml:space="preserve"> the following criteria shall be eligible for financing under this Facility:</w:t>
+              <w:t>Only receivables which satisfy all of the following criteria shall be eligible for financing under this Facility:</w:t>
             </w:r>
           </w:p>
           <w:p>
@@ -7481,6 +7177,7 @@
                 <w:sz w:val="20"/>
                 <w:szCs w:val="20"/>
               </w:rPr>
+              <w:lastRenderedPageBreak/>
               <w:t>the receivable is not subject to any prior assignment, charge, encumbrance or restriction;</w:t>
             </w:r>
           </w:p>
@@ -7810,49 +7507,7 @@
           <w:sz w:val="20"/>
           <w:szCs w:val="20"/>
         </w:rPr>
-        <w:t xml:space="preserve">the contract dated </w:t>
-      </w:r>
-      <w:r>
-        <w:rPr>
-          <w:sz w:val="20"/>
-          <w:szCs w:val="20"/>
-        </w:rPr>
-        <w:t>{assigned_contract_date}</w:t>
-      </w:r>
-      <w:r>
-        <w:rPr>
-          <w:sz w:val="20"/>
-          <w:szCs w:val="20"/>
-        </w:rPr>
-        <w:t xml:space="preserve"> between </w:t>
-      </w:r>
-      <w:r>
-        <w:rPr>
-          <w:sz w:val="20"/>
-          <w:szCs w:val="20"/>
-        </w:rPr>
-        <w:t>{assigned_contract_counterparty}</w:t>
-      </w:r>
-      <w:r>
-        <w:rPr>
-          <w:sz w:val="20"/>
-          <w:szCs w:val="20"/>
-        </w:rPr>
-        <w:t xml:space="preserve"> and the Issuer for the </w:t>
-      </w:r>
-      <w:r>
-        <w:rPr>
-          <w:sz w:val="20"/>
-          <w:szCs w:val="20"/>
-        </w:rPr>
-        <w:t>{assigned_contract_description}</w:t>
-      </w:r>
-      <w:r>
-        <w:rPr>
-          <w:sz w:val="20"/>
-          <w:szCs w:val="20"/>
-        </w:rPr>
-        <w:t xml:space="preserve"> (“Contract 1”); and</w:t>
+        <w:t>the contract dated {assigned_contract_date} between {assigned_contract_counterparty} and the Issuer for the {assigned_contract_description} (“Contract 1”); and</w:t>
       </w:r>
     </w:p>
     <w:p>
@@ -7965,9 +7620,13 @@
           <w:szCs w:val="20"/>
           <w:u w:val="single"/>
         </w:rPr>
-        <w:t xml:space="preserve">RE : LETTER OF OFFER ON ACCOUNT RECEIVABLE FINANCING-i (“FACILITY”) DATED </w:t>
-      </w:r>
-      <w:r>
+        <w:t>RE : LETTER OF OFFER ON ACCOUNT RECEIVABLE FINANCING-i (“FACILITY”) DATED {letter_date}</w:t>
+      </w:r>
+    </w:p>
+    <w:p>
+      <w:pPr>
+        <w:spacing w:line="360" w:lineRule="auto"/>
+        <w:jc w:val="both"/>
         <w:rPr>
           <w:b/>
           <w:bCs/>
@@ -7975,8 +7634,7 @@
           <w:szCs w:val="20"/>
           <w:u w:val="single"/>
         </w:rPr>
-        <w:t>{letter_date}</w:t>
-      </w:r>
+      </w:pPr>
     </w:p>
     <w:p>
       <w:pPr>
@@ -7990,81 +7648,26 @@
           <w:u w:val="single"/>
         </w:rPr>
       </w:pPr>
-    </w:p>
-    <w:p>
-      <w:pPr>
-        <w:spacing w:line="360" w:lineRule="auto"/>
-        <w:jc w:val="both"/>
-        <w:rPr>
-          <w:b/>
-          <w:bCs/>
-          <w:sz w:val="20"/>
-          <w:szCs w:val="20"/>
-          <w:u w:val="single"/>
-        </w:rPr>
-      </w:pPr>
-      <w:r>
-        <w:rPr>
-          <w:sz w:val="20"/>
-          <w:szCs w:val="20"/>
-        </w:rPr>
-        <w:t xml:space="preserve">We, </w:t>
-      </w:r>
-      <w:r>
-        <w:rPr>
-          <w:sz w:val="20"/>
-          <w:szCs w:val="20"/>
-        </w:rPr>
-        <w:t>{issuer_name}</w:t>
-      </w:r>
-      <w:r>
-        <w:rPr>
-          <w:sz w:val="20"/>
-          <w:szCs w:val="20"/>
-        </w:rPr>
-        <w:t xml:space="preserve"> (Registration No.: </w:t>
-      </w:r>
-      <w:r>
-        <w:rPr>
-          <w:sz w:val="20"/>
-          <w:szCs w:val="20"/>
-        </w:rPr>
-        <w:t>{issuer_registration_number}</w:t>
-      </w:r>
-      <w:r>
-        <w:rPr>
-          <w:sz w:val="20"/>
-          <w:szCs w:val="20"/>
-        </w:rPr>
-        <w:t xml:space="preserve"> having a registered address at </w:t>
-      </w:r>
-      <w:r>
-        <w:rPr>
-          <w:sz w:val="20"/>
-          <w:szCs w:val="20"/>
-        </w:rPr>
-        <w:t>{issuer_address}</w:t>
-      </w:r>
-      <w:r>
-        <w:rPr>
-          <w:sz w:val="20"/>
-          <w:szCs w:val="20"/>
-        </w:rPr>
-        <w:t xml:space="preserve"> hereby confirm our acceptance of the offer of the Financing Facility of </w:t>
-      </w:r>
-      <w:r>
-        <w:rPr>
-          <w:sz w:val="20"/>
-          <w:szCs w:val="20"/>
-        </w:rPr>
-        <w:t>{financing_limit_rm}</w:t>
-      </w:r>
-      <w:r>
-        <w:rPr>
-          <w:sz w:val="20"/>
-          <w:szCs w:val="20"/>
-        </w:rPr>
-        <w:t xml:space="preserve"> ("the Facility") based upon the terms as set out above and/or and in the Schedule(s) of the Letter of Offer and/or may appear in the Transaction Documents to be executed pursuant to the Facility.</w:t>
+      <w:r>
+        <w:rPr>
+          <w:sz w:val="20"/>
+          <w:szCs w:val="20"/>
+        </w:rPr>
+        <w:t>We, {issuer_name} (Registration No.: {issuer_registration_number}</w:t>
+      </w:r>
+      <w:r>
+        <w:rPr>
+          <w:sz w:val="20"/>
+          <w:szCs w:val="20"/>
+        </w:rPr>
+        <w:t>)</w:t>
+      </w:r>
+      <w:r>
+        <w:rPr>
+          <w:sz w:val="20"/>
+          <w:szCs w:val="20"/>
+        </w:rPr>
+        <w:t xml:space="preserve"> having a registered address at {issuer_address} hereby confirm our acceptance of the offer of the Financing Facility of {financing_limit_rm} ("the Facility") based upon the terms as set out above and/or and in the Schedule(s) of the Letter of Offer and/or may appear in the Transaction Documents to be executed pursuant to the Facility.</w:t>
       </w:r>
     </w:p>
     <w:p>
@@ -8205,28 +7808,7 @@
           <w:sz w:val="20"/>
           <w:szCs w:val="20"/>
         </w:rPr>
-        <w:t>{issuer_name}</w:t>
-      </w:r>
-      <w:r>
-        <w:rPr>
-          <w:sz w:val="20"/>
-          <w:szCs w:val="20"/>
-        </w:rPr>
-        <w:t xml:space="preserve"> (Company No. </w:t>
-      </w:r>
-      <w:r>
-        <w:rPr>
-          <w:sz w:val="20"/>
-          <w:szCs w:val="20"/>
-        </w:rPr>
-        <w:t>{issuer_registration_number}</w:t>
-      </w:r>
-      <w:r>
-        <w:rPr>
-          <w:sz w:val="20"/>
-          <w:szCs w:val="20"/>
-        </w:rPr>
-        <w:t>)</w:t>
+        <w:t>{issuer_name} (Company No. {issuer_registration_number})</w:t>
       </w:r>
     </w:p>
     <w:p>
@@ -8372,59 +7954,24 @@
           <w:sz w:val="20"/>
           <w:szCs w:val="20"/>
         </w:rPr>
-        <w:t xml:space="preserve">being the Guarantors in respect of the Facility by SHORAKA SUYULA PLATFORM SDN BHD (Reg. No : 202101033028 (1433328-H)) to </w:t>
-      </w:r>
-      <w:r>
-        <w:rPr>
-          <w:sz w:val="20"/>
-          <w:szCs w:val="20"/>
-        </w:rPr>
-        <w:t>{issuer_name}</w:t>
-      </w:r>
-      <w:r>
-        <w:rPr>
-          <w:sz w:val="20"/>
-          <w:szCs w:val="20"/>
-        </w:rPr>
-        <w:t xml:space="preserve"> hereby agree to the terms and conditions stated in this Letter of Offer dated </w:t>
-      </w:r>
-      <w:r>
-        <w:rPr>
-          <w:sz w:val="20"/>
-          <w:szCs w:val="20"/>
-        </w:rPr>
-        <w:t>{letter_date}</w:t>
-      </w:r>
-      <w:r>
-        <w:rPr>
-          <w:sz w:val="20"/>
-          <w:szCs w:val="20"/>
-        </w:rPr>
-        <w:t>.</w:t>
-      </w:r>
-    </w:p>
-    <w:p>
-      <w:pPr>
-        <w:spacing w:line="360" w:lineRule="auto"/>
-        <w:jc w:val="both"/>
-        <w:rPr>
-          <w:sz w:val="20"/>
-          <w:szCs w:val="20"/>
-        </w:rPr>
-      </w:pPr>
-      <w:r>
-        <w:rPr>
-          <w:sz w:val="20"/>
-          <w:szCs w:val="20"/>
-        </w:rPr>
-        <w:t xml:space="preserve">For the avoidance of doubt, the obligations and liabilities of the Guarantors under this Letter of Offer shall be further set out in a Guarantee Agreement to be executed by the Guarantors in favour of Shoraka Suyula Platform Sdn. Bhd. (Reg. No : 202101033028 (1433328-H)). The Guarantors expressly acknowledge and agree that the execution of such Guarantee Agreement shall constitute a condition precedent to the disbursement of the Facility and that the detailed terms, covenants and undertakings therein shall </w:t>
-      </w:r>
-      <w:r>
-        <w:rPr>
-          <w:sz w:val="20"/>
-          <w:szCs w:val="20"/>
-        </w:rPr>
-        <w:t>prevail and be binding upon the Guarantors in addition to the provisions of this Letter of Offer.</w:t>
+        <w:t>being the Guarantors in respect of the Facility by SHORAKA SUYULA PLATFORM SDN BHD (Reg. No : 202101033028 (1433328-H)) to {issuer_name} hereby agree to the terms and conditions stated in this Letter of Offer dated {letter_date}.</w:t>
+      </w:r>
+    </w:p>
+    <w:p>
+      <w:pPr>
+        <w:spacing w:line="360" w:lineRule="auto"/>
+        <w:jc w:val="both"/>
+        <w:rPr>
+          <w:sz w:val="20"/>
+          <w:szCs w:val="20"/>
+        </w:rPr>
+      </w:pPr>
+      <w:r>
+        <w:rPr>
+          <w:sz w:val="20"/>
+          <w:szCs w:val="20"/>
+        </w:rPr>
+        <w:t>For the avoidance of doubt, the obligations and liabilities of the Guarantors under this Letter of Offer shall be further set out in a Guarantee Agreement to be executed by the Guarantors in favour of Shoraka Suyula Platform Sdn. Bhd. (Reg. No : 202101033028 (1433328-H)). The Guarantors expressly acknowledge and agree that the execution of such Guarantee Agreement shall constitute a condition precedent to the disbursement of the Facility and that the detailed terms, covenants and undertakings therein shall prevail and be binding upon the Guarantors in addition to the provisions of this Letter of Offer.</w:t>
       </w:r>
     </w:p>
     <w:p>
@@ -8512,14 +8059,7 @@
           <w:sz w:val="20"/>
           <w:szCs w:val="20"/>
         </w:rPr>
-        <w:t xml:space="preserve">NRIC : </w:t>
-      </w:r>
-      <w:r>
-        <w:rPr>
-          <w:sz w:val="20"/>
-          <w:szCs w:val="20"/>
-        </w:rPr>
-        <w:t>{nric}</w:t>
+        <w:t>NRIC : {nric}</w:t>
       </w:r>
     </w:p>
     <w:p>
@@ -8679,87 +8219,24 @@
           <w:sz w:val="20"/>
           <w:szCs w:val="20"/>
         </w:rPr>
-        <w:t xml:space="preserve">We, </w:t>
-      </w:r>
-      <w:r>
-        <w:rPr>
-          <w:sz w:val="20"/>
-          <w:szCs w:val="20"/>
-        </w:rPr>
-        <w:t>{company_name}</w:t>
-      </w:r>
-      <w:r>
-        <w:rPr>
-          <w:sz w:val="20"/>
-          <w:szCs w:val="20"/>
-        </w:rPr>
-        <w:t xml:space="preserve"> (Registration No. </w:t>
-      </w:r>
-      <w:r>
-        <w:rPr>
-          <w:sz w:val="20"/>
-          <w:szCs w:val="20"/>
-        </w:rPr>
-        <w:t>{company_ssm}</w:t>
-      </w:r>
-      <w:r>
-        <w:rPr>
-          <w:sz w:val="20"/>
-          <w:szCs w:val="20"/>
-        </w:rPr>
-        <w:t xml:space="preserve">) being the Guarantor in respect of the Facility by SHORAKA SUYULA PLATFORM SDN BHD (Reg. No : 202101033028 (1433328-H)) to </w:t>
-      </w:r>
-      <w:r>
-        <w:rPr>
-          <w:sz w:val="20"/>
-          <w:szCs w:val="20"/>
-        </w:rPr>
-        <w:t>{issuer_name}</w:t>
-      </w:r>
-      <w:r>
-        <w:rPr>
-          <w:sz w:val="20"/>
-          <w:szCs w:val="20"/>
-        </w:rPr>
-        <w:t xml:space="preserve"> hereby agree to the terms and conditions stated in this Letter of Offer dated </w:t>
-      </w:r>
-      <w:r>
-        <w:rPr>
-          <w:sz w:val="20"/>
-          <w:szCs w:val="20"/>
-        </w:rPr>
-        <w:t>{letter_date}</w:t>
-      </w:r>
-      <w:r>
-        <w:rPr>
-          <w:sz w:val="20"/>
-          <w:szCs w:val="20"/>
-        </w:rPr>
-        <w:t>.</w:t>
-      </w:r>
-    </w:p>
-    <w:p>
-      <w:pPr>
-        <w:spacing w:line="360" w:lineRule="auto"/>
-        <w:jc w:val="both"/>
-        <w:rPr>
-          <w:sz w:val="20"/>
-          <w:szCs w:val="20"/>
-        </w:rPr>
-      </w:pPr>
-      <w:r>
-        <w:rPr>
-          <w:sz w:val="20"/>
-          <w:szCs w:val="20"/>
-        </w:rPr>
-        <w:t xml:space="preserve">For the avoidance of doubt, the obligations and liabilities of the Guarantors under this Letter of Offer shall be further set out in a Guarantee Agreement to be executed by the Guarantors in favour of Shoraka Suyula Platform Sdn. Bhd. (Reg. No : 202101033028 (1433328-H)). The Guarantors expressly acknowledge and agree that the execution of such Guarantee Agreement shall constitute a condition precedent to the disbursement of the Facility and that the detailed terms, covenants and undertakings therein shall </w:t>
-      </w:r>
-      <w:r>
-        <w:rPr>
-          <w:sz w:val="20"/>
-          <w:szCs w:val="20"/>
-        </w:rPr>
-        <w:t>prevail and be binding upon the Guarantors in addition to the provisions of this Letter of Offer.</w:t>
+        <w:t>We, {company_name} (Registration No. {company_ssm}) being the Guarantor in respect of the Facility by SHORAKA SUYULA PLATFORM SDN BHD (Reg. No : 202101033028 (1433328-H)) to {issuer_name} hereby agree to the terms and conditions stated in this Letter of Offer dated {letter_date}.</w:t>
+      </w:r>
+    </w:p>
+    <w:p>
+      <w:pPr>
+        <w:spacing w:line="360" w:lineRule="auto"/>
+        <w:jc w:val="both"/>
+        <w:rPr>
+          <w:sz w:val="20"/>
+          <w:szCs w:val="20"/>
+        </w:rPr>
+      </w:pPr>
+      <w:r>
+        <w:rPr>
+          <w:sz w:val="20"/>
+          <w:szCs w:val="20"/>
+        </w:rPr>
+        <w:t>For the avoidance of doubt, the obligations and liabilities of the Guarantors under this Letter of Offer shall be further set out in a Guarantee Agreement to be executed by the Guarantors in favour of Shoraka Suyula Platform Sdn. Bhd. (Reg. No : 202101033028 (1433328-H)). The Guarantors expressly acknowledge and agree that the execution of such Guarantee Agreement shall constitute a condition precedent to the disbursement of the Facility and that the detailed terms, covenants and undertakings therein shall prevail and be binding upon the Guarantors in addition to the provisions of this Letter of Offer.</w:t>
       </w:r>
     </w:p>
     <w:p>
@@ -8820,14 +8297,7 @@
           <w:sz w:val="20"/>
           <w:szCs w:val="20"/>
         </w:rPr>
-        <w:t xml:space="preserve">For and on behalf of </w:t>
-      </w:r>
-      <w:r>
-        <w:rPr>
-          <w:sz w:val="20"/>
-          <w:szCs w:val="20"/>
-        </w:rPr>
-        <w:t>{company_name}</w:t>
+        <w:t>For and on behalf of {company_name}</w:t>
       </w:r>
     </w:p>
     <w:p>
@@ -8949,14 +8419,7 @@
                 <w:sz w:val="20"/>
                 <w:szCs w:val="20"/>
               </w:rPr>
-              <w:t xml:space="preserve">NRIC : </w:t>
-            </w:r>
-            <w:r>
-              <w:rPr>
-                <w:sz w:val="20"/>
-                <w:szCs w:val="20"/>
-              </w:rPr>
-              <w:t>{left_nric}</w:t>
+              <w:t>NRIC : {left_nric}</w:t>
             </w:r>
           </w:p>
           <w:p>
@@ -9065,14 +8528,7 @@
                 <w:sz w:val="20"/>
                 <w:szCs w:val="20"/>
               </w:rPr>
-              <w:t xml:space="preserve">NRIC : </w:t>
-            </w:r>
-            <w:r>
-              <w:rPr>
-                <w:sz w:val="20"/>
-                <w:szCs w:val="20"/>
-              </w:rPr>
-              <w:t>{right_nric}</w:t>
+              <w:t>NRIC : {right_nric}</w:t>
             </w:r>
           </w:p>
           <w:p>
@@ -9126,7 +8582,6 @@
           <w:sz w:val="20"/>
           <w:szCs w:val="20"/>
         </w:rPr>
-        <w:lastRenderedPageBreak/>
         <w:t>{/corporate_guarantor_pages}</w:t>
       </w:r>
     </w:p>
@@ -9711,23 +9166,7 @@
           <w:sz w:val="20"/>
           <w:szCs w:val="20"/>
         </w:rPr>
-        <w:t xml:space="preserve">Active Account Management: Operate your account in a fully active and satisfactory manner, ensuring that the approved Financing Limit (for a Part A Contract-Based Facility) and the terms of each Investment Note are </w:t>
-      </w:r>
-      <w:proofErr w:type="gramStart"/>
-      <w:r>
-        <w:rPr>
-          <w:sz w:val="20"/>
-          <w:szCs w:val="20"/>
-        </w:rPr>
-        <w:t>observed at all times</w:t>
-      </w:r>
-      <w:proofErr w:type="gramEnd"/>
-      <w:r>
-        <w:rPr>
-          <w:sz w:val="20"/>
-          <w:szCs w:val="20"/>
-        </w:rPr>
-        <w:t>.</w:t>
+        <w:t>Active Account Management: Operate your account in a fully active and satisfactory manner, ensuring that the approved Financing Limit (for a Part A Contract-Based Facility) and the terms of each Investment Note are observed at all times.</w:t>
       </w:r>
     </w:p>
     <w:p>

</xml_diff>